<commit_message>
docs: reparto por integrante y plan final
</commit_message>
<xml_diff>
--- a/docs/Arquitectura-y-flujo-de-trabajo-Where-I-Parked-It.docx
+++ b/docs/Arquitectura-y-flujo-de-trabajo-Where-I-Parked-It.docx
@@ -13,7 +13,7 @@
     <w:p>
       <w:pPr/>
       <w:r>
-        <w:t xml:space="preserve">Oct 23, 2026</w:t>
+        <w:t xml:space="preserve">Oct 25, 2026</w:t>
       </w:r>
       <w:r>
         <w:t xml:space="preserve"> · </w:t>
@@ -6404,13 +6404,22 @@
         <w:pStyle w:val="Heading2"/>
       </w:pPr>
       <w:r>
-        <w:t xml:space="preserve">7. Plan para el lunes</w:t>
+        <w:t xml:space="preserve">7. Reparto por integrante y plan final</w:t>
       </w:r>
     </w:p>
     <w:p>
       <w:pPr/>
       <w:r>
-        <w:t xml:space="preserve">El esqueleto ya trae la base de las tres apps, así que cada día se dedica a probar, corregir y pulir. El orden protege lo más riesgoso: el reloj primero, la integración el domingo y el lunes solo correcciones.</w:t>
+        <w:t xml:space="preserve">Cada integrante es dueño de un módulo (una carpeta del repo) y lo entrega funcionando el lunes 26 a las 15:00. Al domingo 25 a las 22:00, </w:t>
+      </w:r>
+      <w:r>
+        <w:rPr>
+          <w:rStyle w:val="CodeChar"/>
+        </w:rPr>
+        <w:t xml:space="preserve">main</w:t>
+      </w:r>
+      <w:r>
+        <w:t xml:space="preserve"> solo tiene el commit del esqueleto y no hay PRs, así que lo que queda se reparte desde esta noche.</w:t>
       </w:r>
     </w:p>
     <w:tbl>
@@ -6421,10 +6430,10 @@
         <w:tblLook w:val="04A0" w:firstRow="1" w:lastRow="0" w:firstColumn="0" w:lastColumn="0" w:noHBand="0" w:noVBand="1"/>
       </w:tblPr>
       <w:tblGrid>
-        <w:gridCol w:w="1661"/>
-        <w:gridCol w:w="2985"/>
-        <w:gridCol w:w="2410"/>
-        <w:gridCol w:w="2304"/>
+        <w:gridCol w:w="1266"/>
+        <w:gridCol w:w="2540"/>
+        <w:gridCol w:w="2342"/>
+        <w:gridCol w:w="3212"/>
       </w:tblGrid>
       <w:tr>
         <w:trPr>
@@ -6432,49 +6441,49 @@
         </w:trPr>
         <w:tc>
           <w:tcPr>
-            <w:tcW w:w="1661" w:type="dxa"/>
+            <w:tcW w:w="1266" w:type="dxa"/>
             <w:shd w:val="clear" w:color="auto" w:fill="F2F2F2"/>
           </w:tcPr>
           <w:p>
             <w:pPr/>
             <w:r>
-              <w:t xml:space="preserve">Día</w:t>
-            </w:r>
-          </w:p>
-        </w:tc>
-        <w:tc>
-          <w:tcPr>
-            <w:tcW w:w="2985" w:type="dxa"/>
+              <w:t xml:space="preserve">Integrante</w:t>
+            </w:r>
+          </w:p>
+        </w:tc>
+        <w:tc>
+          <w:tcPr>
+            <w:tcW w:w="2540" w:type="dxa"/>
             <w:shd w:val="clear" w:color="auto" w:fill="F2F2F2"/>
           </w:tcPr>
           <w:p>
             <w:pPr/>
             <w:r>
-              <w:t xml:space="preserve">Isabel (API y repo)</w:t>
-            </w:r>
-          </w:p>
-        </w:tc>
-        <w:tc>
-          <w:tcPr>
-            <w:tcW w:w="2410" w:type="dxa"/>
+              <w:t xml:space="preserve">Módulo</w:t>
+            </w:r>
+          </w:p>
+        </w:tc>
+        <w:tc>
+          <w:tcPr>
+            <w:tcW w:w="2342" w:type="dxa"/>
             <w:shd w:val="clear" w:color="auto" w:fill="F2F2F2"/>
           </w:tcPr>
           <w:p>
             <w:pPr/>
             <w:r>
-              <w:t xml:space="preserve">Jeshua (reloj)</w:t>
-            </w:r>
-          </w:p>
-        </w:tc>
-        <w:tc>
-          <w:tcPr>
-            <w:tcW w:w="2304" w:type="dxa"/>
+              <w:t xml:space="preserve">Carpeta</w:t>
+            </w:r>
+          </w:p>
+        </w:tc>
+        <w:tc>
+          <w:tcPr>
+            <w:tcW w:w="3212" w:type="dxa"/>
             <w:shd w:val="clear" w:color="auto" w:fill="F2F2F2"/>
           </w:tcPr>
           <w:p>
             <w:pPr/>
             <w:r>
-              <w:t xml:space="preserve">Kassie (móvil)</w:t>
+              <w:t xml:space="preserve">Pasos de la demo que le tocan</w:t>
             </w:r>
           </w:p>
         </w:tc>
@@ -6482,54 +6491,48 @@
       <w:tr>
         <w:tc>
           <w:tcPr>
-            <w:tcW w:w="1661" w:type="dxa"/>
-          </w:tcPr>
-          <w:p>
-            <w:pPr/>
-            <w:r>
-              <w:t xml:space="preserve">Vie 23, noche</w:t>
-            </w:r>
-          </w:p>
-        </w:tc>
-        <w:tc>
-          <w:tcPr>
-            <w:tcW w:w="2985" w:type="dxa"/>
-          </w:tcPr>
-          <w:p>
-            <w:pPr/>
-            <w:r>
-              <w:t xml:space="preserve">Primer push del esqueleto, colaboradores, ruleset, check </w:t>
-            </w:r>
+            <w:tcW w:w="1266" w:type="dxa"/>
+          </w:tcPr>
+          <w:p>
+            <w:pPr/>
+            <w:r>
+              <w:t xml:space="preserve">Jeshua</w:t>
+            </w:r>
+          </w:p>
+        </w:tc>
+        <w:tc>
+          <w:tcPr>
+            <w:tcW w:w="2540" w:type="dxa"/>
+          </w:tcPr>
+          <w:p>
+            <w:pPr/>
+            <w:r>
+              <w:t xml:space="preserve">Reloj Wear OS</w:t>
+            </w:r>
+          </w:p>
+        </w:tc>
+        <w:tc>
+          <w:tcPr>
+            <w:tcW w:w="2342" w:type="dxa"/>
+          </w:tcPr>
+          <w:p>
+            <w:pPr/>
             <w:r>
               <w:rPr>
                 <w:rStyle w:val="CodeChar"/>
               </w:rPr>
-              <w:t xml:space="preserve">ci</w:t>
-            </w:r>
-            <w:r>
-              <w:t xml:space="preserve">, etiquetas e issues</w:t>
-            </w:r>
-          </w:p>
-        </w:tc>
-        <w:tc>
-          <w:tcPr>
-            <w:tcW w:w="2410" w:type="dxa"/>
-          </w:tcPr>
-          <w:p>
-            <w:pPr/>
-            <w:r>
-              <w:t xml:space="preserve">Preparar computadora; correr la app del reloj en el emulador Wear OS</w:t>
-            </w:r>
-          </w:p>
-        </w:tc>
-        <w:tc>
-          <w:tcPr>
-            <w:tcW w:w="2304" w:type="dxa"/>
-          </w:tcPr>
-          <w:p>
-            <w:pPr/>
-            <w:r>
-              <w:t xml:space="preserve">Preparar computadora; correr la app móvil en Expo Go en el emulador</w:t>
+              <w:t xml:space="preserve">apps/watch</w:t>
+            </w:r>
+          </w:p>
+        </w:tc>
+        <w:tc>
+          <w:tcPr>
+            <w:tcW w:w="3212" w:type="dxa"/>
+          </w:tcPr>
+          <w:p>
+            <w:pPr/>
+            <w:r>
+              <w:t xml:space="preserve">2, 4 y 6</w:t>
             </w:r>
           </w:p>
         </w:tc>
@@ -6537,155 +6540,117 @@
       <w:tr>
         <w:tc>
           <w:tcPr>
-            <w:tcW w:w="1661" w:type="dxa"/>
-          </w:tcPr>
-          <w:p>
-            <w:pPr/>
-            <w:r>
-              <w:t xml:space="preserve">Sáb 24</w:t>
-            </w:r>
-          </w:p>
-        </w:tc>
-        <w:tc>
-          <w:tcPr>
-            <w:tcW w:w="2985" w:type="dxa"/>
-          </w:tcPr>
-          <w:p>
-            <w:pPr/>
-            <w:r>
-              <w:t xml:space="preserve">Desplegar API en Railway; clave de Google Maps; revisar PRs dos veces al día</w:t>
-            </w:r>
-          </w:p>
-        </w:tc>
-        <w:tc>
-          <w:tcPr>
-            <w:tcW w:w="2410" w:type="dxa"/>
-          </w:tcPr>
-          <w:p>
-            <w:pPr/>
-            <w:r>
-              <w:t xml:space="preserve">Guardar, brújula y emparejar funcionando en el emulador; ajustar la UI redonda</w:t>
-            </w:r>
-          </w:p>
-        </w:tc>
-        <w:tc>
-          <w:tcPr>
-            <w:tcW w:w="2304" w:type="dxa"/>
-          </w:tcPr>
-          <w:p>
-            <w:pPr/>
-            <w:r>
-              <w:t xml:space="preserve">Login, vehículos, historial y mapa contra la API; iconos de pestañas</w:t>
-            </w:r>
-          </w:p>
-        </w:tc>
-      </w:tr>
-      <w:tr>
-        <w:tc>
-          <w:tcPr>
-            <w:tcW w:w="1661" w:type="dxa"/>
-          </w:tcPr>
-          <w:p>
-            <w:pPr/>
-            <w:r>
-              <w:t xml:space="preserve">Dom 25</w:t>
-            </w:r>
-          </w:p>
-        </w:tc>
-        <w:tc>
-          <w:tcPr>
-            <w:tcW w:w="2985" w:type="dxa"/>
-          </w:tcPr>
-          <w:p>
-            <w:pPr/>
-            <w:r>
-              <w:t xml:space="preserve">Pruebas en tu teléfono; corregir errores de API y sync</w:t>
-            </w:r>
-          </w:p>
-        </w:tc>
-        <w:tc>
-          <w:tcPr>
-            <w:tcW w:w="2410" w:type="dxa"/>
-          </w:tcPr>
-          <w:p>
-            <w:pPr/>
-            <w:r>
-              <w:t xml:space="preserve">Prueba de modo avión de punta a punta; correcciones</w:t>
-            </w:r>
-          </w:p>
-        </w:tc>
-        <w:tc>
-          <w:tcPr>
-            <w:tcW w:w="2304" w:type="dxa"/>
-          </w:tcPr>
-          <w:p>
-            <w:pPr/>
-            <w:r>
-              <w:t xml:space="preserve">Diseño final, editar vehículos, filtro del historial</w:t>
-            </w:r>
-          </w:p>
-        </w:tc>
-      </w:tr>
-      <w:tr>
-        <w:tc>
-          <w:tcPr>
-            <w:tcW w:w="1661" w:type="dxa"/>
-          </w:tcPr>
-          <w:p>
-            <w:pPr/>
-            <w:r>
-              <w:t xml:space="preserve">Lun 26</w:t>
-            </w:r>
-          </w:p>
-        </w:tc>
-        <w:tc>
-          <w:tcPr>
-            <w:tcW w:w="2985" w:type="dxa"/>
-          </w:tcPr>
-          <w:p>
-            <w:pPr/>
-            <w:r>
-              <w:t xml:space="preserve">Build de APKs, flujo completo de la demo, video, tag </w:t>
-            </w:r>
+            <w:tcW w:w="1266" w:type="dxa"/>
+          </w:tcPr>
+          <w:p>
+            <w:pPr/>
+            <w:r>
+              <w:t xml:space="preserve">Kassie</w:t>
+            </w:r>
+          </w:p>
+        </w:tc>
+        <w:tc>
+          <w:tcPr>
+            <w:tcW w:w="2540" w:type="dxa"/>
+          </w:tcPr>
+          <w:p>
+            <w:pPr/>
+            <w:r>
+              <w:t xml:space="preserve">App móvil</w:t>
+            </w:r>
+          </w:p>
+        </w:tc>
+        <w:tc>
+          <w:tcPr>
+            <w:tcW w:w="2342" w:type="dxa"/>
+          </w:tcPr>
+          <w:p>
+            <w:pPr/>
             <w:r>
               <w:rPr>
                 <w:rStyle w:val="CodeChar"/>
               </w:rPr>
-              <w:t xml:space="preserve">v1.0.0</w:t>
-            </w:r>
-          </w:p>
-        </w:tc>
-        <w:tc>
-          <w:tcPr>
-            <w:tcW w:w="2410" w:type="dxa"/>
-          </w:tcPr>
-          <w:p>
-            <w:pPr/>
-            <w:r>
-              <w:t xml:space="preserve">Solo correcciones</w:t>
-            </w:r>
-          </w:p>
-        </w:tc>
-        <w:tc>
-          <w:tcPr>
-            <w:tcW w:w="2304" w:type="dxa"/>
-          </w:tcPr>
-          <w:p>
-            <w:pPr/>
-            <w:r>
-              <w:t xml:space="preserve">Solo correcciones</w:t>
+              <w:t xml:space="preserve">apps/mobile</w:t>
+            </w:r>
+          </w:p>
+        </w:tc>
+        <w:tc>
+          <w:tcPr>
+            <w:tcW w:w="3212" w:type="dxa"/>
+          </w:tcPr>
+          <w:p>
+            <w:pPr/>
+            <w:r>
+              <w:t xml:space="preserve">1, 3 y 5</w:t>
+            </w:r>
+          </w:p>
+        </w:tc>
+      </w:tr>
+      <w:tr>
+        <w:tc>
+          <w:tcPr>
+            <w:tcW w:w="1266" w:type="dxa"/>
+          </w:tcPr>
+          <w:p>
+            <w:pPr/>
+            <w:r>
+              <w:t xml:space="preserve">Isabel</w:t>
+            </w:r>
+          </w:p>
+        </w:tc>
+        <w:tc>
+          <w:tcPr>
+            <w:tcW w:w="2540" w:type="dxa"/>
+          </w:tcPr>
+          <w:p>
+            <w:pPr/>
+            <w:r>
+              <w:t xml:space="preserve">API, integración y entrega</w:t>
+            </w:r>
+          </w:p>
+        </w:tc>
+        <w:tc>
+          <w:tcPr>
+            <w:tcW w:w="2342" w:type="dxa"/>
+          </w:tcPr>
+          <w:p>
+            <w:pPr/>
+            <w:r>
+              <w:rPr>
+                <w:rStyle w:val="CodeChar"/>
+              </w:rPr>
+              <w:t xml:space="preserve">apps/api</w:t>
+            </w:r>
+            <w:r>
+              <w:t xml:space="preserve">, repo, </w:t>
+            </w:r>
+            <w:r>
+              <w:rPr>
+                <w:rStyle w:val="CodeChar"/>
+              </w:rPr>
+              <w:t xml:space="preserve">docs/</w:t>
+            </w:r>
+          </w:p>
+        </w:tc>
+        <w:tc>
+          <w:tcPr>
+            <w:tcW w:w="3212" w:type="dxa"/>
+          </w:tcPr>
+          <w:p>
+            <w:pPr/>
+            <w:r>
+              <w:t xml:space="preserve">Flujo completo en su teléfono</w:t>
             </w:r>
           </w:p>
         </w:tc>
       </w:tr>
     </w:tbl>
     <w:p>
-      <w:pPr/>
-      <w:r>
-        <w:rPr>
-          <w:b/>
-        </w:rPr>
-        <w:t xml:space="preserve">Puntos de control (todos):</w:t>
+      <w:pPr>
+        <w:pStyle w:val="Heading3"/>
+      </w:pPr>
+      <w:r>
+        <w:t xml:space="preserve">Reglas para las últimas horas</w:t>
       </w:r>
     </w:p>
     <w:p>
@@ -6697,16 +6662,13 @@
         </w:numPr>
       </w:pPr>
       <w:r>
-        <w:t xml:space="preserve">☐ Viernes 23, 23:00: el esqueleto está en </w:t>
-      </w:r>
-      <w:r>
-        <w:rPr>
-          <w:rStyle w:val="CodeChar"/>
-        </w:rPr>
-        <w:t xml:space="preserve">main</w:t>
-      </w:r>
-      <w:r>
-        <w:t xml:space="preserve"> y las tres apps arrancan en las tres computadoras</w:t>
+        <w:rPr>
+          <w:b/>
+        </w:rPr>
+        <w:t xml:space="preserve">Cada quien trabaja solo en su carpeta.</w:t>
+      </w:r>
+      <w:r>
+        <w:t xml:space="preserve"> Si alguien necesita cambiar algo en la carpeta de otra persona, primero avisa en el grupo.</w:t>
       </w:r>
     </w:p>
     <w:p>
@@ -6718,7 +6680,22 @@
         </w:numPr>
       </w:pPr>
       <w:r>
-        <w:t xml:space="preserve">☐ Sábado 24, 12:00: decisión sobre el reloj (seguir con React Native o plan B)</w:t>
+        <w:rPr>
+          <w:b/>
+        </w:rPr>
+        <w:t xml:space="preserve">La API solo la cambia Isabel.</w:t>
+      </w:r>
+      <w:r>
+        <w:t xml:space="preserve"> Si a la app móvil o al reloj les falta un dato, se pide; no se modifica </w:t>
+      </w:r>
+      <w:r>
+        <w:rPr>
+          <w:rStyle w:val="CodeChar"/>
+        </w:rPr>
+        <w:t xml:space="preserve">apps/api</w:t>
+      </w:r>
+      <w:r>
+        <w:t xml:space="preserve">.</w:t>
       </w:r>
     </w:p>
     <w:p>
@@ -6730,7 +6707,13 @@
         </w:numPr>
       </w:pPr>
       <w:r>
-        <w:t xml:space="preserve">☐ Sábado 24, 20:00: emparejar, guardar y ver en el móvil funciona en emuladores</w:t>
+        <w:rPr>
+          <w:b/>
+        </w:rPr>
+        <w:t xml:space="preserve">PRs pequeños y frecuentes.</w:t>
+      </w:r>
+      <w:r>
+        <w:t xml:space="preserve"> Isabel revisa el domingo a las 23:30 y después cada 2 horas el lunes.</w:t>
       </w:r>
     </w:p>
     <w:p>
@@ -6742,97 +6725,36 @@
         </w:numPr>
       </w:pPr>
       <w:r>
-        <w:t xml:space="preserve">☐ Domingo 25, 20:00: se congela </w:t>
-      </w:r>
-      <w:r>
-        <w:rPr>
-          <w:rStyle w:val="CodeChar"/>
-        </w:rPr>
-        <w:t xml:space="preserve">main</w:t>
-      </w:r>
-      <w:r>
-        <w:t xml:space="preserve">; la prueba de modo avión pasa en el teléfono de Isabel</w:t>
-      </w:r>
-    </w:p>
-    <w:p>
-      <w:pPr>
-        <w:pStyle w:val="ListParagraph"/>
-        <w:numPr>
-          <w:ilvl w:val="0"/>
-          <w:numId w:val="20"/>
-        </w:numPr>
-      </w:pPr>
-      <w:r>
-        <w:t xml:space="preserve">☐ Lunes 26, 12:00: APKs instalados y flujo de la demo completo</w:t>
-      </w:r>
-    </w:p>
-    <w:p>
-      <w:pPr>
-        <w:pStyle w:val="ListParagraph"/>
-        <w:numPr>
-          <w:ilvl w:val="0"/>
-          <w:numId w:val="20"/>
-        </w:numPr>
-      </w:pPr>
-      <w:r>
-        <w:t xml:space="preserve">☐ Lunes 26, 15:00: tag </w:t>
-      </w:r>
-      <w:r>
-        <w:rPr>
-          <w:rStyle w:val="CodeChar"/>
-        </w:rPr>
-        <w:t xml:space="preserve">v1.0.0</w:t>
-      </w:r>
-      <w:r>
-        <w:t xml:space="preserve"> y video de respaldo grabado: proyecto listo</w:t>
+        <w:rPr>
+          <w:b/>
+        </w:rPr>
+        <w:t xml:space="preserve">Ya no se agregan funciones:</w:t>
+      </w:r>
+      <w:r>
+        <w:t xml:space="preserve"> solo se hace funcionar lo que ya trae el esqueleto.</w:t>
+      </w:r>
+    </w:p>
+    <w:p>
+      <w:pPr>
+        <w:pStyle w:val="Heading3"/>
+      </w:pPr>
+      <w:r>
+        <w:t xml:space="preserve">Jeshua: módulo Reloj (</w:t>
+      </w:r>
+      <w:r>
+        <w:rPr>
+          <w:rStyle w:val="CodeChar"/>
+        </w:rPr>
+        <w:t xml:space="preserve">apps/watch</w:t>
+      </w:r>
+      <w:r>
+        <w:t xml:space="preserve">)</w:t>
       </w:r>
     </w:p>
     <w:p>
       <w:pPr/>
       <w:r>
-        <w:rPr>
-          <w:b/>
-        </w:rPr>
-        <w:t xml:space="preserve">Issues para crear hoy en GitHub</w:t>
-      </w:r>
-      <w:r>
-        <w:t xml:space="preserve"> (uno por fila; etiquetas </w:t>
-      </w:r>
-      <w:r>
-        <w:rPr>
-          <w:rStyle w:val="CodeChar"/>
-        </w:rPr>
-        <w:t xml:space="preserve">api</w:t>
-      </w:r>
-      <w:r>
-        <w:t xml:space="preserve">, </w:t>
-      </w:r>
-      <w:r>
-        <w:rPr>
-          <w:rStyle w:val="CodeChar"/>
-        </w:rPr>
-        <w:t xml:space="preserve">mobile</w:t>
-      </w:r>
-      <w:r>
-        <w:t xml:space="preserve">, </w:t>
-      </w:r>
-      <w:r>
-        <w:rPr>
-          <w:rStyle w:val="CodeChar"/>
-        </w:rPr>
-        <w:t xml:space="preserve">watch</w:t>
-      </w:r>
-      <w:r>
-        <w:t xml:space="preserve">, </w:t>
-      </w:r>
-      <w:r>
-        <w:rPr>
-          <w:rStyle w:val="CodeChar"/>
-        </w:rPr>
-        <w:t xml:space="preserve">probar-en-dispositivo</w:t>
-      </w:r>
-      <w:r>
-        <w:t xml:space="preserve">):</w:t>
+        <w:t xml:space="preserve">Es el módulo de mayor riesgo, así que va primero.</w:t>
       </w:r>
     </w:p>
     <w:tbl>
@@ -6843,9 +6765,10 @@
         <w:tblLook w:val="04A0" w:firstRow="1" w:lastRow="0" w:firstColumn="0" w:lastColumn="0" w:noHBand="0" w:noVBand="1"/>
       </w:tblPr>
       <w:tblGrid>
-        <w:gridCol w:w="4920"/>
-        <w:gridCol w:w="1542"/>
-        <w:gridCol w:w="2898"/>
+        <w:gridCol w:w="1471"/>
+        <w:gridCol w:w="2590"/>
+        <w:gridCol w:w="2340"/>
+        <w:gridCol w:w="2959"/>
       </w:tblGrid>
       <w:tr>
         <w:trPr>
@@ -6853,37 +6776,49 @@
         </w:trPr>
         <w:tc>
           <w:tcPr>
-            <w:tcW w:w="4920" w:type="dxa"/>
+            <w:tcW w:w="1471" w:type="dxa"/>
             <w:shd w:val="clear" w:color="auto" w:fill="F2F2F2"/>
           </w:tcPr>
           <w:p>
             <w:pPr/>
             <w:r>
-              <w:t xml:space="preserve">Issue</w:t>
-            </w:r>
-          </w:p>
-        </w:tc>
-        <w:tc>
-          <w:tcPr>
-            <w:tcW w:w="1542" w:type="dxa"/>
+              <w:t xml:space="preserve">Orden</w:t>
+            </w:r>
+          </w:p>
+        </w:tc>
+        <w:tc>
+          <w:tcPr>
+            <w:tcW w:w="2590" w:type="dxa"/>
             <w:shd w:val="clear" w:color="auto" w:fill="F2F2F2"/>
           </w:tcPr>
           <w:p>
             <w:pPr/>
             <w:r>
-              <w:t xml:space="preserve">Responsable</w:t>
-            </w:r>
-          </w:p>
-        </w:tc>
-        <w:tc>
-          <w:tcPr>
-            <w:tcW w:w="2898" w:type="dxa"/>
+              <w:t xml:space="preserve">Tarea</w:t>
+            </w:r>
+          </w:p>
+        </w:tc>
+        <w:tc>
+          <w:tcPr>
+            <w:tcW w:w="2340" w:type="dxa"/>
             <w:shd w:val="clear" w:color="auto" w:fill="F2F2F2"/>
           </w:tcPr>
           <w:p>
             <w:pPr/>
             <w:r>
-              <w:t xml:space="preserve">Etiqueta</w:t>
+              <w:t xml:space="preserve">Archivos</w:t>
+            </w:r>
+          </w:p>
+        </w:tc>
+        <w:tc>
+          <w:tcPr>
+            <w:tcW w:w="2959" w:type="dxa"/>
+            <w:shd w:val="clear" w:color="auto" w:fill="F2F2F2"/>
+          </w:tcPr>
+          <w:p>
+            <w:pPr/>
+            <w:r>
+              <w:t xml:space="preserve">Terminado cuando</w:t>
             </w:r>
           </w:p>
         </w:tc>
@@ -6891,67 +6826,35 @@
       <w:tr>
         <w:tc>
           <w:tcPr>
-            <w:tcW w:w="4920" w:type="dxa"/>
-          </w:tcPr>
-          <w:p>
-            <w:pPr/>
-            <w:r>
-              <w:t xml:space="preserve">Reloj corre en emulador Wear OS con el esqueleto</w:t>
-            </w:r>
-          </w:p>
-        </w:tc>
-        <w:tc>
-          <w:tcPr>
-            <w:tcW w:w="1542" w:type="dxa"/>
-          </w:tcPr>
-          <w:p>
-            <w:pPr/>
-            <w:r>
-              <w:t xml:space="preserve">Jeshua</w:t>
-            </w:r>
-          </w:p>
-        </w:tc>
-        <w:tc>
-          <w:tcPr>
-            <w:tcW w:w="2898" w:type="dxa"/>
-          </w:tcPr>
-          <w:p>
-            <w:pPr/>
+            <w:tcW w:w="1471" w:type="dxa"/>
+          </w:tcPr>
+          <w:p>
+            <w:pPr/>
+            <w:r>
+              <w:t xml:space="preserve">1 (domingo)</w:t>
+            </w:r>
+          </w:p>
+        </w:tc>
+        <w:tc>
+          <w:tcPr>
+            <w:tcW w:w="2590" w:type="dxa"/>
+          </w:tcPr>
+          <w:p>
+            <w:pPr/>
+            <w:r>
+              <w:t xml:space="preserve">Correr la app en el emulador Wear OS con </w:t>
+            </w:r>
             <w:r>
               <w:rPr>
                 <w:rStyle w:val="CodeChar"/>
               </w:rPr>
-              <w:t xml:space="preserve">watch</w:t>
-            </w:r>
-          </w:p>
-        </w:tc>
-      </w:tr>
-      <w:tr>
-        <w:tc>
-          <w:tcPr>
-            <w:tcW w:w="4920" w:type="dxa"/>
-          </w:tcPr>
-          <w:p>
-            <w:pPr/>
-            <w:r>
-              <w:t xml:space="preserve">Ajustar UI del reloj a pantalla redonda</w:t>
-            </w:r>
-          </w:p>
-        </w:tc>
-        <w:tc>
-          <w:tcPr>
-            <w:tcW w:w="1542" w:type="dxa"/>
-          </w:tcPr>
-          <w:p>
-            <w:pPr/>
-            <w:r>
-              <w:t xml:space="preserve">Jeshua</w:t>
-            </w:r>
-          </w:p>
-        </w:tc>
-        <w:tc>
-          <w:tcPr>
-            <w:tcW w:w="2898" w:type="dxa"/>
+              <w:t xml:space="preserve">npm run android</w:t>
+            </w:r>
+          </w:p>
+        </w:tc>
+        <w:tc>
+          <w:tcPr>
+            <w:tcW w:w="2340" w:type="dxa"/>
           </w:tcPr>
           <w:p>
             <w:pPr/>
@@ -6959,92 +6862,85 @@
               <w:rPr>
                 <w:rStyle w:val="CodeChar"/>
               </w:rPr>
-              <w:t xml:space="preserve">watch</w:t>
-            </w:r>
-          </w:p>
-        </w:tc>
-      </w:tr>
-      <w:tr>
-        <w:tc>
-          <w:tcPr>
-            <w:tcW w:w="4920" w:type="dxa"/>
-          </w:tcPr>
-          <w:p>
-            <w:pPr/>
-            <w:r>
-              <w:t xml:space="preserve">Validar brújula y distancia con ubicación simulada</w:t>
-            </w:r>
-          </w:p>
-        </w:tc>
-        <w:tc>
-          <w:tcPr>
-            <w:tcW w:w="1542" w:type="dxa"/>
-          </w:tcPr>
-          <w:p>
-            <w:pPr/>
-            <w:r>
-              <w:t xml:space="preserve">Jeshua</w:t>
-            </w:r>
-          </w:p>
-        </w:tc>
-        <w:tc>
-          <w:tcPr>
-            <w:tcW w:w="2898" w:type="dxa"/>
-          </w:tcPr>
-          <w:p>
-            <w:pPr/>
+              <w:t xml:space="preserve">app.json</w:t>
+            </w:r>
+            <w:r>
+              <w:t xml:space="preserve">, </w:t>
+            </w:r>
             <w:r>
               <w:rPr>
                 <w:rStyle w:val="CodeChar"/>
               </w:rPr>
-              <w:t xml:space="preserve">watch</w:t>
-            </w:r>
-            <w:r>
-              <w:t xml:space="preserve">, </w:t>
-            </w:r>
+              <w:t xml:space="preserve">plugins/withWearOS.js</w:t>
+            </w:r>
+          </w:p>
+        </w:tc>
+        <w:tc>
+          <w:tcPr>
+            <w:tcW w:w="2959" w:type="dxa"/>
+          </w:tcPr>
+          <w:p>
+            <w:pPr/>
+            <w:r>
+              <w:t xml:space="preserve">La pantalla de emparejar muestra un código</w:t>
+            </w:r>
+          </w:p>
+        </w:tc>
+      </w:tr>
+      <w:tr>
+        <w:tc>
+          <w:tcPr>
+            <w:tcW w:w="1471" w:type="dxa"/>
+          </w:tcPr>
+          <w:p>
+            <w:pPr/>
+            <w:r>
+              <w:t xml:space="preserve">2 (domingo)</w:t>
+            </w:r>
+          </w:p>
+        </w:tc>
+        <w:tc>
+          <w:tcPr>
+            <w:tcW w:w="2590" w:type="dxa"/>
+          </w:tcPr>
+          <w:p>
+            <w:pPr/>
+            <w:r>
+              <w:t xml:space="preserve">Emparejar con la API y sincronizar el vehículo</w:t>
+            </w:r>
+          </w:p>
+        </w:tc>
+        <w:tc>
+          <w:tcPr>
+            <w:tcW w:w="2340" w:type="dxa"/>
+          </w:tcPr>
+          <w:p>
+            <w:pPr/>
             <w:r>
               <w:rPr>
                 <w:rStyle w:val="CodeChar"/>
               </w:rPr>
-              <w:t xml:space="preserve">probar-en-dispositivo</w:t>
-            </w:r>
-          </w:p>
-        </w:tc>
-      </w:tr>
-      <w:tr>
-        <w:tc>
-          <w:tcPr>
-            <w:tcW w:w="4920" w:type="dxa"/>
-          </w:tcPr>
-          <w:p>
-            <w:pPr/>
-            <w:r>
-              <w:t xml:space="preserve">App móvil corre en Expo Go con login y vehículos</w:t>
-            </w:r>
-          </w:p>
-        </w:tc>
-        <w:tc>
-          <w:tcPr>
-            <w:tcW w:w="1542" w:type="dxa"/>
-          </w:tcPr>
-          <w:p>
-            <w:pPr/>
-            <w:r>
-              <w:t xml:space="preserve">Kassie</w:t>
-            </w:r>
-          </w:p>
-        </w:tc>
-        <w:tc>
-          <w:tcPr>
-            <w:tcW w:w="2898" w:type="dxa"/>
-          </w:tcPr>
-          <w:p>
-            <w:pPr/>
+              <w:t xml:space="preserve">src/screens/PairScreen.tsx</w:t>
+            </w:r>
+            <w:r>
+              <w:t xml:space="preserve">, </w:t>
+            </w:r>
             <w:r>
               <w:rPr>
                 <w:rStyle w:val="CodeChar"/>
               </w:rPr>
-              <w:t xml:space="preserve">mobile</w:t>
+              <w:t xml:space="preserve">src/sync.ts</w:t>
+            </w:r>
+          </w:p>
+        </w:tc>
+        <w:tc>
+          <w:tcPr>
+            <w:tcW w:w="2959" w:type="dxa"/>
+          </w:tcPr>
+          <w:p>
+            <w:pPr/>
+            <w:r>
+              <w:t xml:space="preserve">El inicio muestra el nombre del vehículo</w:t>
             </w:r>
           </w:p>
         </w:tc>
@@ -7052,29 +6948,29 @@
       <w:tr>
         <w:tc>
           <w:tcPr>
-            <w:tcW w:w="4920" w:type="dxa"/>
-          </w:tcPr>
-          <w:p>
-            <w:pPr/>
-            <w:r>
-              <w:t xml:space="preserve">Iconos, diseño y editar vehículos</w:t>
-            </w:r>
-          </w:p>
-        </w:tc>
-        <w:tc>
-          <w:tcPr>
-            <w:tcW w:w="1542" w:type="dxa"/>
-          </w:tcPr>
-          <w:p>
-            <w:pPr/>
-            <w:r>
-              <w:t xml:space="preserve">Kassie</w:t>
-            </w:r>
-          </w:p>
-        </w:tc>
-        <w:tc>
-          <w:tcPr>
-            <w:tcW w:w="2898" w:type="dxa"/>
+            <w:tcW w:w="1471" w:type="dxa"/>
+          </w:tcPr>
+          <w:p>
+            <w:pPr/>
+            <w:r>
+              <w:t xml:space="preserve">3</w:t>
+            </w:r>
+          </w:p>
+        </w:tc>
+        <w:tc>
+          <w:tcPr>
+            <w:tcW w:w="2590" w:type="dxa"/>
+          </w:tcPr>
+          <w:p>
+            <w:pPr/>
+            <w:r>
+              <w:t xml:space="preserve">Guardar con nivel en modo avión</w:t>
+            </w:r>
+          </w:p>
+        </w:tc>
+        <w:tc>
+          <w:tcPr>
+            <w:tcW w:w="2340" w:type="dxa"/>
           </w:tcPr>
           <w:p>
             <w:pPr/>
@@ -7082,92 +6978,85 @@
               <w:rPr>
                 <w:rStyle w:val="CodeChar"/>
               </w:rPr>
-              <w:t xml:space="preserve">mobile</w:t>
-            </w:r>
-          </w:p>
-        </w:tc>
-      </w:tr>
-      <w:tr>
-        <w:tc>
-          <w:tcPr>
-            <w:tcW w:w="4920" w:type="dxa"/>
-          </w:tcPr>
-          <w:p>
-            <w:pPr/>
-            <w:r>
-              <w:t xml:space="preserve">Mapa y permisos de ubicación en el teléfono real</w:t>
-            </w:r>
-          </w:p>
-        </w:tc>
-        <w:tc>
-          <w:tcPr>
-            <w:tcW w:w="1542" w:type="dxa"/>
-          </w:tcPr>
-          <w:p>
-            <w:pPr/>
-            <w:r>
-              <w:t xml:space="preserve">Kassie</w:t>
-            </w:r>
-          </w:p>
-        </w:tc>
-        <w:tc>
-          <w:tcPr>
-            <w:tcW w:w="2898" w:type="dxa"/>
-          </w:tcPr>
-          <w:p>
-            <w:pPr/>
+              <w:t xml:space="preserve">src/screens/SaveScreen.tsx</w:t>
+            </w:r>
+            <w:r>
+              <w:t xml:space="preserve">, </w:t>
+            </w:r>
             <w:r>
               <w:rPr>
                 <w:rStyle w:val="CodeChar"/>
               </w:rPr>
-              <w:t xml:space="preserve">mobile</w:t>
-            </w:r>
-            <w:r>
-              <w:t xml:space="preserve">, </w:t>
-            </w:r>
+              <w:t xml:space="preserve">src/db.ts</w:t>
+            </w:r>
+          </w:p>
+        </w:tc>
+        <w:tc>
+          <w:tcPr>
+            <w:tcW w:w="2959" w:type="dxa"/>
+          </w:tcPr>
+          <w:p>
+            <w:pPr/>
+            <w:r>
+              <w:t xml:space="preserve">Al quitar el modo avión, el estacionamiento aparece en el móvil</w:t>
+            </w:r>
+          </w:p>
+        </w:tc>
+      </w:tr>
+      <w:tr>
+        <w:tc>
+          <w:tcPr>
+            <w:tcW w:w="1471" w:type="dxa"/>
+          </w:tcPr>
+          <w:p>
+            <w:pPr/>
+            <w:r>
+              <w:t xml:space="preserve">4</w:t>
+            </w:r>
+          </w:p>
+        </w:tc>
+        <w:tc>
+          <w:tcPr>
+            <w:tcW w:w="2590" w:type="dxa"/>
+          </w:tcPr>
+          <w:p>
+            <w:pPr/>
+            <w:r>
+              <w:t xml:space="preserve">Flecha y distancia con ubicación simulada</w:t>
+            </w:r>
+          </w:p>
+        </w:tc>
+        <w:tc>
+          <w:tcPr>
+            <w:tcW w:w="2340" w:type="dxa"/>
+          </w:tcPr>
+          <w:p>
+            <w:pPr/>
             <w:r>
               <w:rPr>
                 <w:rStyle w:val="CodeChar"/>
               </w:rPr>
-              <w:t xml:space="preserve">probar-en-dispositivo</w:t>
-            </w:r>
-          </w:p>
-        </w:tc>
-      </w:tr>
-      <w:tr>
-        <w:tc>
-          <w:tcPr>
-            <w:tcW w:w="4920" w:type="dxa"/>
-          </w:tcPr>
-          <w:p>
-            <w:pPr/>
-            <w:r>
-              <w:t xml:space="preserve">Desplegar API y MySQL en Railway</w:t>
-            </w:r>
-          </w:p>
-        </w:tc>
-        <w:tc>
-          <w:tcPr>
-            <w:tcW w:w="1542" w:type="dxa"/>
-          </w:tcPr>
-          <w:p>
-            <w:pPr/>
-            <w:r>
-              <w:t xml:space="preserve">Isabel</w:t>
-            </w:r>
-          </w:p>
-        </w:tc>
-        <w:tc>
-          <w:tcPr>
-            <w:tcW w:w="2898" w:type="dxa"/>
-          </w:tcPr>
-          <w:p>
-            <w:pPr/>
+              <w:t xml:space="preserve">src/screens/FindScreen.tsx</w:t>
+            </w:r>
+            <w:r>
+              <w:t xml:space="preserve">, </w:t>
+            </w:r>
             <w:r>
               <w:rPr>
                 <w:rStyle w:val="CodeChar"/>
               </w:rPr>
-              <w:t xml:space="preserve">api</w:t>
+              <w:t xml:space="preserve">src/geo.ts</w:t>
+            </w:r>
+          </w:p>
+        </w:tc>
+        <w:tc>
+          <w:tcPr>
+            <w:tcW w:w="2959" w:type="dxa"/>
+          </w:tcPr>
+          <w:p>
+            <w:pPr/>
+            <w:r>
+              <w:t xml:space="preserve">La flecha gira y la distancia cambia al mover la ubicación</w:t>
             </w:r>
           </w:p>
         </w:tc>
@@ -7175,12 +7064,711 @@
       <w:tr>
         <w:tc>
           <w:tcPr>
+            <w:tcW w:w="1471" w:type="dxa"/>
+          </w:tcPr>
+          <w:p>
+            <w:pPr/>
+            <w:r>
+              <w:t xml:space="preserve">5</w:t>
+            </w:r>
+          </w:p>
+        </w:tc>
+        <w:tc>
+          <w:tcPr>
+            <w:tcW w:w="2590" w:type="dxa"/>
+          </w:tcPr>
+          <w:p>
+            <w:pPr/>
+            <w:r>
+              <w:t xml:space="preserve">Ajustar la interfaz a la pantalla redonda</w:t>
+            </w:r>
+          </w:p>
+        </w:tc>
+        <w:tc>
+          <w:tcPr>
+            <w:tcW w:w="2340" w:type="dxa"/>
+          </w:tcPr>
+          <w:p>
+            <w:pPr/>
+            <w:r>
+              <w:rPr>
+                <w:rStyle w:val="CodeChar"/>
+              </w:rPr>
+              <w:t xml:space="preserve">src/ui.tsx</w:t>
+            </w:r>
+          </w:p>
+        </w:tc>
+        <w:tc>
+          <w:tcPr>
+            <w:tcW w:w="2959" w:type="dxa"/>
+          </w:tcPr>
+          <w:p>
+            <w:pPr/>
+            <w:r>
+              <w:t xml:space="preserve">Ningún texto o botón queda recortado</w:t>
+            </w:r>
+          </w:p>
+        </w:tc>
+      </w:tr>
+    </w:tbl>
+    <w:p>
+      <w:pPr/>
+      <w:r>
+        <w:t xml:space="preserve">Ramas: </w:t>
+      </w:r>
+      <w:r>
+        <w:rPr>
+          <w:rStyle w:val="CodeChar"/>
+        </w:rPr>
+        <w:t xml:space="preserve">feat/watch-emulador</w:t>
+      </w:r>
+      <w:r>
+        <w:t xml:space="preserve"> y </w:t>
+      </w:r>
+      <w:r>
+        <w:rPr>
+          <w:rStyle w:val="CodeChar"/>
+        </w:rPr>
+        <w:t xml:space="preserve">feat/watch-ui-redonda</w:t>
+      </w:r>
+      <w:r>
+        <w:t xml:space="preserve">. Si el paso 1 no funciona el domingo antes de las 00:00, Jeshua avisa en ese momento para resolverlo con Isabel el lunes a las 8:00.</w:t>
+      </w:r>
+    </w:p>
+    <w:p>
+      <w:pPr>
+        <w:pStyle w:val="Heading3"/>
+      </w:pPr>
+      <w:r>
+        <w:t xml:space="preserve">Kassie: módulo Móvil (</w:t>
+      </w:r>
+      <w:r>
+        <w:rPr>
+          <w:rStyle w:val="CodeChar"/>
+        </w:rPr>
+        <w:t xml:space="preserve">apps/mobile</w:t>
+      </w:r>
+      <w:r>
+        <w:t xml:space="preserve">)</w:t>
+      </w:r>
+    </w:p>
+    <w:tbl>
+      <w:tblPr>
+        <w:tblStyle w:val="TableGrid"/>
+        <w:tblW w:w="0" w:type="auto"/>
+        <w:tblLayout w:type="fixed"/>
+        <w:tblLook w:val="04A0" w:firstRow="1" w:lastRow="0" w:firstColumn="0" w:lastColumn="0" w:noHBand="0" w:noVBand="1"/>
+      </w:tblPr>
+      <w:tblGrid>
+        <w:gridCol w:w="1471"/>
+        <w:gridCol w:w="2663"/>
+        <w:gridCol w:w="2585"/>
+        <w:gridCol w:w="2641"/>
+      </w:tblGrid>
+      <w:tr>
+        <w:trPr>
+          <w:tblHeader/>
+        </w:trPr>
+        <w:tc>
+          <w:tcPr>
+            <w:tcW w:w="1471" w:type="dxa"/>
+            <w:shd w:val="clear" w:color="auto" w:fill="F2F2F2"/>
+          </w:tcPr>
+          <w:p>
+            <w:pPr/>
+            <w:r>
+              <w:t xml:space="preserve">Orden</w:t>
+            </w:r>
+          </w:p>
+        </w:tc>
+        <w:tc>
+          <w:tcPr>
+            <w:tcW w:w="2663" w:type="dxa"/>
+            <w:shd w:val="clear" w:color="auto" w:fill="F2F2F2"/>
+          </w:tcPr>
+          <w:p>
+            <w:pPr/>
+            <w:r>
+              <w:t xml:space="preserve">Tarea</w:t>
+            </w:r>
+          </w:p>
+        </w:tc>
+        <w:tc>
+          <w:tcPr>
+            <w:tcW w:w="2585" w:type="dxa"/>
+            <w:shd w:val="clear" w:color="auto" w:fill="F2F2F2"/>
+          </w:tcPr>
+          <w:p>
+            <w:pPr/>
+            <w:r>
+              <w:t xml:space="preserve">Archivos</w:t>
+            </w:r>
+          </w:p>
+        </w:tc>
+        <w:tc>
+          <w:tcPr>
+            <w:tcW w:w="2641" w:type="dxa"/>
+            <w:shd w:val="clear" w:color="auto" w:fill="F2F2F2"/>
+          </w:tcPr>
+          <w:p>
+            <w:pPr/>
+            <w:r>
+              <w:t xml:space="preserve">Terminado cuando</w:t>
+            </w:r>
+          </w:p>
+        </w:tc>
+      </w:tr>
+      <w:tr>
+        <w:tc>
+          <w:tcPr>
+            <w:tcW w:w="1471" w:type="dxa"/>
+          </w:tcPr>
+          <w:p>
+            <w:pPr/>
+            <w:r>
+              <w:t xml:space="preserve">1 (domingo)</w:t>
+            </w:r>
+          </w:p>
+        </w:tc>
+        <w:tc>
+          <w:tcPr>
+            <w:tcW w:w="2663" w:type="dxa"/>
+          </w:tcPr>
+          <w:p>
+            <w:pPr/>
+            <w:r>
+              <w:t xml:space="preserve">Correr la app en Expo Go en el emulador con </w:t>
+            </w:r>
+            <w:r>
+              <w:rPr>
+                <w:rStyle w:val="CodeChar"/>
+              </w:rPr>
+              <w:t xml:space="preserve">npm start</w:t>
+            </w:r>
+            <w:r>
+              <w:t xml:space="preserve"> + tecla </w:t>
+            </w:r>
+            <w:r>
+              <w:rPr>
+                <w:rStyle w:val="CodeChar"/>
+              </w:rPr>
+              <w:t xml:space="preserve">a</w:t>
+            </w:r>
+          </w:p>
+        </w:tc>
+        <w:tc>
+          <w:tcPr>
+            <w:tcW w:w="2585" w:type="dxa"/>
+          </w:tcPr>
+          <w:p>
+            <w:pPr/>
+            <w:r>
+              <w:rPr>
+                <w:rStyle w:val="CodeChar"/>
+              </w:rPr>
+              <w:t xml:space="preserve">.env</w:t>
+            </w:r>
+          </w:p>
+        </w:tc>
+        <w:tc>
+          <w:tcPr>
+            <w:tcW w:w="2641" w:type="dxa"/>
+          </w:tcPr>
+          <w:p>
+            <w:pPr/>
+            <w:r>
+              <w:t xml:space="preserve">Aparece la pantalla de login</w:t>
+            </w:r>
+          </w:p>
+        </w:tc>
+      </w:tr>
+      <w:tr>
+        <w:tc>
+          <w:tcPr>
+            <w:tcW w:w="1471" w:type="dxa"/>
+          </w:tcPr>
+          <w:p>
+            <w:pPr/>
+            <w:r>
+              <w:t xml:space="preserve">2 (domingo)</w:t>
+            </w:r>
+          </w:p>
+        </w:tc>
+        <w:tc>
+          <w:tcPr>
+            <w:tcW w:w="2663" w:type="dxa"/>
+          </w:tcPr>
+          <w:p>
+            <w:pPr/>
+            <w:r>
+              <w:t xml:space="preserve">Registro, login y vehículos</w:t>
+            </w:r>
+          </w:p>
+        </w:tc>
+        <w:tc>
+          <w:tcPr>
+            <w:tcW w:w="2585" w:type="dxa"/>
+          </w:tcPr>
+          <w:p>
+            <w:pPr/>
+            <w:r>
+              <w:rPr>
+                <w:rStyle w:val="CodeChar"/>
+              </w:rPr>
+              <w:t xml:space="preserve">src/app/login.tsx</w:t>
+            </w:r>
+            <w:r>
+              <w:t xml:space="preserve">, </w:t>
+            </w:r>
+            <w:r>
+              <w:rPr>
+                <w:rStyle w:val="CodeChar"/>
+              </w:rPr>
+              <w:t xml:space="preserve">src/app/(tabs)/vehiculos.tsx</w:t>
+            </w:r>
+          </w:p>
+        </w:tc>
+        <w:tc>
+          <w:tcPr>
+            <w:tcW w:w="2641" w:type="dxa"/>
+          </w:tcPr>
+          <w:p>
+            <w:pPr/>
+            <w:r>
+              <w:t xml:space="preserve">Puede crear una cuenta y agregar un vehículo</w:t>
+            </w:r>
+          </w:p>
+        </w:tc>
+      </w:tr>
+      <w:tr>
+        <w:tc>
+          <w:tcPr>
+            <w:tcW w:w="1471" w:type="dxa"/>
+          </w:tcPr>
+          <w:p>
+            <w:pPr/>
+            <w:r>
+              <w:t xml:space="preserve">3</w:t>
+            </w:r>
+          </w:p>
+        </w:tc>
+        <w:tc>
+          <w:tcPr>
+            <w:tcW w:w="2663" w:type="dxa"/>
+          </w:tcPr>
+          <w:p>
+            <w:pPr/>
+            <w:r>
+              <w:t xml:space="preserve">"Mi coche" con mapa y "Ya lo recogí"</w:t>
+            </w:r>
+          </w:p>
+        </w:tc>
+        <w:tc>
+          <w:tcPr>
+            <w:tcW w:w="2585" w:type="dxa"/>
+          </w:tcPr>
+          <w:p>
+            <w:pPr/>
+            <w:r>
+              <w:rPr>
+                <w:rStyle w:val="CodeChar"/>
+              </w:rPr>
+              <w:t xml:space="preserve">src/app/(tabs)/index.tsx</w:t>
+            </w:r>
+          </w:p>
+        </w:tc>
+        <w:tc>
+          <w:tcPr>
+            <w:tcW w:w="2641" w:type="dxa"/>
+          </w:tcPr>
+          <w:p>
+            <w:pPr/>
+            <w:r>
+              <w:t xml:space="preserve">Se ve el marcador de lo que guardó el reloj</w:t>
+            </w:r>
+          </w:p>
+        </w:tc>
+      </w:tr>
+      <w:tr>
+        <w:tc>
+          <w:tcPr>
+            <w:tcW w:w="1471" w:type="dxa"/>
+          </w:tcPr>
+          <w:p>
+            <w:pPr/>
+            <w:r>
+              <w:t xml:space="preserve">4</w:t>
+            </w:r>
+          </w:p>
+        </w:tc>
+        <w:tc>
+          <w:tcPr>
+            <w:tcW w:w="2663" w:type="dxa"/>
+          </w:tcPr>
+          <w:p>
+            <w:pPr/>
+            <w:r>
+              <w:t xml:space="preserve">Historial y emparejar reloj</w:t>
+            </w:r>
+          </w:p>
+        </w:tc>
+        <w:tc>
+          <w:tcPr>
+            <w:tcW w:w="2585" w:type="dxa"/>
+          </w:tcPr>
+          <w:p>
+            <w:pPr/>
+            <w:r>
+              <w:rPr>
+                <w:rStyle w:val="CodeChar"/>
+              </w:rPr>
+              <w:t xml:space="preserve">src/app/(tabs)/historial.tsx</w:t>
+            </w:r>
+            <w:r>
+              <w:t xml:space="preserve">, </w:t>
+            </w:r>
+            <w:r>
+              <w:rPr>
+                <w:rStyle w:val="CodeChar"/>
+              </w:rPr>
+              <w:t xml:space="preserve">src/app/(tabs)/ajustes.tsx</w:t>
+            </w:r>
+          </w:p>
+        </w:tc>
+        <w:tc>
+          <w:tcPr>
+            <w:tcW w:w="2641" w:type="dxa"/>
+          </w:tcPr>
+          <w:p>
+            <w:pPr/>
+            <w:r>
+              <w:t xml:space="preserve">El código del reloj se confirma desde aquí</w:t>
+            </w:r>
+          </w:p>
+        </w:tc>
+      </w:tr>
+      <w:tr>
+        <w:tc>
+          <w:tcPr>
+            <w:tcW w:w="1471" w:type="dxa"/>
+          </w:tcPr>
+          <w:p>
+            <w:pPr/>
+            <w:r>
+              <w:t xml:space="preserve">5</w:t>
+            </w:r>
+          </w:p>
+        </w:tc>
+        <w:tc>
+          <w:tcPr>
+            <w:tcW w:w="2663" w:type="dxa"/>
+          </w:tcPr>
+          <w:p>
+            <w:pPr/>
+            <w:r>
+              <w:t xml:space="preserve">Diseño: iconos de pestañas, colores y espacios</w:t>
+            </w:r>
+          </w:p>
+        </w:tc>
+        <w:tc>
+          <w:tcPr>
+            <w:tcW w:w="2585" w:type="dxa"/>
+          </w:tcPr>
+          <w:p>
+            <w:pPr/>
+            <w:r>
+              <w:rPr>
+                <w:rStyle w:val="CodeChar"/>
+              </w:rPr>
+              <w:t xml:space="preserve">src/lib/ui.tsx</w:t>
+            </w:r>
+            <w:r>
+              <w:t xml:space="preserve">, </w:t>
+            </w:r>
+            <w:r>
+              <w:rPr>
+                <w:rStyle w:val="CodeChar"/>
+              </w:rPr>
+              <w:t xml:space="preserve">src/app/(tabs)/_layout.tsx</w:t>
+            </w:r>
+          </w:p>
+        </w:tc>
+        <w:tc>
+          <w:tcPr>
+            <w:tcW w:w="2641" w:type="dxa"/>
+          </w:tcPr>
+          <w:p>
+            <w:pPr/>
+            <w:r>
+              <w:t xml:space="preserve">Se ve presentable para la demo</w:t>
+            </w:r>
+          </w:p>
+        </w:tc>
+      </w:tr>
+    </w:tbl>
+    <w:p>
+      <w:pPr/>
+      <w:r>
+        <w:t xml:space="preserve">Ramas: </w:t>
+      </w:r>
+      <w:r>
+        <w:rPr>
+          <w:rStyle w:val="CodeChar"/>
+        </w:rPr>
+        <w:t xml:space="preserve">feat/mobile-flujo</w:t>
+      </w:r>
+      <w:r>
+        <w:t xml:space="preserve"> y </w:t>
+      </w:r>
+      <w:r>
+        <w:rPr>
+          <w:rStyle w:val="CodeChar"/>
+        </w:rPr>
+        <w:t xml:space="preserve">feat/mobile-diseno</w:t>
+      </w:r>
+      <w:r>
+        <w:t xml:space="preserve">. Editar vehículos solo si sobra tiempo.</w:t>
+      </w:r>
+    </w:p>
+    <w:p>
+      <w:pPr>
+        <w:pStyle w:val="Heading3"/>
+      </w:pPr>
+      <w:r>
+        <w:t xml:space="preserve">Isabel: API, integración y entrega (</w:t>
+      </w:r>
+      <w:r>
+        <w:rPr>
+          <w:rStyle w:val="CodeChar"/>
+        </w:rPr>
+        <w:t xml:space="preserve">apps/api</w:t>
+      </w:r>
+      <w:r>
+        <w:t xml:space="preserve">, repo, </w:t>
+      </w:r>
+      <w:r>
+        <w:rPr>
+          <w:rStyle w:val="CodeChar"/>
+        </w:rPr>
+        <w:t xml:space="preserve">docs/</w:t>
+      </w:r>
+      <w:r>
+        <w:t xml:space="preserve">)</w:t>
+      </w:r>
+    </w:p>
+    <w:tbl>
+      <w:tblPr>
+        <w:tblStyle w:val="TableGrid"/>
+        <w:tblW w:w="0" w:type="auto"/>
+        <w:tblLayout w:type="fixed"/>
+        <w:tblLook w:val="04A0" w:firstRow="1" w:lastRow="0" w:firstColumn="0" w:lastColumn="0" w:noHBand="0" w:noVBand="1"/>
+      </w:tblPr>
+      <w:tblGrid>
+        <w:gridCol w:w="1752"/>
+        <w:gridCol w:w="4920"/>
+        <w:gridCol w:w="2688"/>
+      </w:tblGrid>
+      <w:tr>
+        <w:trPr>
+          <w:tblHeader/>
+        </w:trPr>
+        <w:tc>
+          <w:tcPr>
+            <w:tcW w:w="1752" w:type="dxa"/>
+            <w:shd w:val="clear" w:color="auto" w:fill="F2F2F2"/>
+          </w:tcPr>
+          <w:p>
+            <w:pPr/>
+            <w:r>
+              <w:t xml:space="preserve">Cuándo</w:t>
+            </w:r>
+          </w:p>
+        </w:tc>
+        <w:tc>
+          <w:tcPr>
             <w:tcW w:w="4920" w:type="dxa"/>
-          </w:tcPr>
-          <w:p>
-            <w:pPr/>
-            <w:r>
-              <w:t xml:space="preserve">Clave de Google Maps y perfil </w:t>
+            <w:shd w:val="clear" w:color="auto" w:fill="F2F2F2"/>
+          </w:tcPr>
+          <w:p>
+            <w:pPr/>
+            <w:r>
+              <w:t xml:space="preserve">Tarea</w:t>
+            </w:r>
+          </w:p>
+        </w:tc>
+        <w:tc>
+          <w:tcPr>
+            <w:tcW w:w="2688" w:type="dxa"/>
+            <w:shd w:val="clear" w:color="auto" w:fill="F2F2F2"/>
+          </w:tcPr>
+          <w:p>
+            <w:pPr/>
+            <w:r>
+              <w:t xml:space="preserve">Terminado cuando</w:t>
+            </w:r>
+          </w:p>
+        </w:tc>
+      </w:tr>
+      <w:tr>
+        <w:tc>
+          <w:tcPr>
+            <w:tcW w:w="1752" w:type="dxa"/>
+          </w:tcPr>
+          <w:p>
+            <w:pPr/>
+            <w:r>
+              <w:t xml:space="preserve">Domingo, antes de que el equipo empiece</w:t>
+            </w:r>
+          </w:p>
+        </w:tc>
+        <w:tc>
+          <w:tcPr>
+            <w:tcW w:w="4920" w:type="dxa"/>
+          </w:tcPr>
+          <w:p>
+            <w:pPr/>
+            <w:r>
+              <w:t xml:space="preserve">Ruleset de </w:t>
+            </w:r>
+            <w:r>
+              <w:rPr>
+                <w:rStyle w:val="CodeChar"/>
+              </w:rPr>
+              <w:t xml:space="preserve">main</w:t>
+            </w:r>
+            <w:r>
+              <w:t xml:space="preserve"> y colaboradores (sección 5.2), si aún no está; levantar la API</w:t>
+            </w:r>
+          </w:p>
+        </w:tc>
+        <w:tc>
+          <w:tcPr>
+            <w:tcW w:w="2688" w:type="dxa"/>
+          </w:tcPr>
+          <w:p>
+            <w:pPr/>
+            <w:r>
+              <w:t xml:space="preserve">Kassie y Jeshua pueden abrir PRs y ver </w:t>
+            </w:r>
+            <w:r>
+              <w:rPr>
+                <w:rStyle w:val="CodeChar"/>
+              </w:rPr>
+              <w:t xml:space="preserve">/health</w:t>
+            </w:r>
+          </w:p>
+        </w:tc>
+      </w:tr>
+      <w:tr>
+        <w:tc>
+          <w:tcPr>
+            <w:tcW w:w="1752" w:type="dxa"/>
+          </w:tcPr>
+          <w:p>
+            <w:pPr/>
+            <w:r>
+              <w:t xml:space="preserve">Domingo</w:t>
+            </w:r>
+          </w:p>
+        </w:tc>
+        <w:tc>
+          <w:tcPr>
+            <w:tcW w:w="4920" w:type="dxa"/>
+          </w:tcPr>
+          <w:p>
+            <w:pPr/>
+            <w:r>
+              <w:t xml:space="preserve">Si sus computadoras no aguantan Docker, desplegar la API en Railway y pasarles la URL</w:t>
+            </w:r>
+          </w:p>
+        </w:tc>
+        <w:tc>
+          <w:tcPr>
+            <w:tcW w:w="2688" w:type="dxa"/>
+          </w:tcPr>
+          <w:p>
+            <w:pPr/>
+            <w:r>
+              <w:t xml:space="preserve">Los dos usan la misma API</w:t>
+            </w:r>
+          </w:p>
+        </w:tc>
+      </w:tr>
+      <w:tr>
+        <w:tc>
+          <w:tcPr>
+            <w:tcW w:w="1752" w:type="dxa"/>
+          </w:tcPr>
+          <w:p>
+            <w:pPr/>
+            <w:r>
+              <w:t xml:space="preserve">Domingo 23:30 y lunes cada 2 h</w:t>
+            </w:r>
+          </w:p>
+        </w:tc>
+        <w:tc>
+          <w:tcPr>
+            <w:tcW w:w="4920" w:type="dxa"/>
+          </w:tcPr>
+          <w:p>
+            <w:pPr/>
+            <w:r>
+              <w:t xml:space="preserve">Revisar y hacer merge de PRs; corregir los errores de API que reporten</w:t>
+            </w:r>
+          </w:p>
+        </w:tc>
+        <w:tc>
+          <w:tcPr>
+            <w:tcW w:w="2688" w:type="dxa"/>
+          </w:tcPr>
+          <w:p>
+            <w:pPr/>
+            <w:r>
+              <w:t xml:space="preserve">Ningún PR espera más de 2 h</w:t>
+            </w:r>
+          </w:p>
+        </w:tc>
+      </w:tr>
+      <w:tr>
+        <w:tc>
+          <w:tcPr>
+            <w:tcW w:w="1752" w:type="dxa"/>
+          </w:tcPr>
+          <w:p>
+            <w:pPr/>
+            <w:r>
+              <w:t xml:space="preserve">Lunes 8:00</w:t>
+            </w:r>
+          </w:p>
+        </w:tc>
+        <w:tc>
+          <w:tcPr>
+            <w:tcW w:w="4920" w:type="dxa"/>
+          </w:tcPr>
+          <w:p>
+            <w:pPr/>
+            <w:r>
+              <w:t xml:space="preserve">Clave de Google Maps y URL de la API en </w:t>
+            </w:r>
+            <w:r>
+              <w:rPr>
+                <w:rStyle w:val="CodeChar"/>
+              </w:rPr>
+              <w:t xml:space="preserve">eas.json</w:t>
+            </w:r>
+            <w:r>
+              <w:t xml:space="preserve"> de las dos apps</w:t>
+            </w:r>
+          </w:p>
+        </w:tc>
+        <w:tc>
+          <w:tcPr>
+            <w:tcW w:w="2688" w:type="dxa"/>
+          </w:tcPr>
+          <w:p>
+            <w:pPr/>
+            <w:r>
+              <w:t xml:space="preserve">El perfil </w:t>
             </w:r>
             <w:r>
               <w:rPr>
@@ -7189,85 +7777,153 @@
               <w:t xml:space="preserve">preview</w:t>
             </w:r>
             <w:r>
-              <w:t xml:space="preserve"> de EAS</w:t>
-            </w:r>
-          </w:p>
-        </w:tc>
-        <w:tc>
-          <w:tcPr>
-            <w:tcW w:w="1542" w:type="dxa"/>
-          </w:tcPr>
-          <w:p>
-            <w:pPr/>
-            <w:r>
-              <w:t xml:space="preserve">Isabel</w:t>
-            </w:r>
-          </w:p>
-        </w:tc>
-        <w:tc>
-          <w:tcPr>
-            <w:tcW w:w="2898" w:type="dxa"/>
-          </w:tcPr>
-          <w:p>
-            <w:pPr/>
+              <w:t xml:space="preserve"> está listo</w:t>
+            </w:r>
+          </w:p>
+        </w:tc>
+      </w:tr>
+      <w:tr>
+        <w:tc>
+          <w:tcPr>
+            <w:tcW w:w="1752" w:type="dxa"/>
+          </w:tcPr>
+          <w:p>
+            <w:pPr/>
+            <w:r>
+              <w:t xml:space="preserve">Lunes 10:00</w:t>
+            </w:r>
+          </w:p>
+        </w:tc>
+        <w:tc>
+          <w:tcPr>
+            <w:tcW w:w="4920" w:type="dxa"/>
+          </w:tcPr>
+          <w:p>
+            <w:pPr/>
+            <w:r>
+              <w:t xml:space="preserve">Lanzar los builds de los dos APK con EAS (respaldo: build local)</w:t>
+            </w:r>
+          </w:p>
+        </w:tc>
+        <w:tc>
+          <w:tcPr>
+            <w:tcW w:w="2688" w:type="dxa"/>
+          </w:tcPr>
+          <w:p>
+            <w:pPr/>
+            <w:r>
+              <w:t xml:space="preserve">APKs instalados en su teléfono y en el emulador</w:t>
+            </w:r>
+          </w:p>
+        </w:tc>
+      </w:tr>
+      <w:tr>
+        <w:tc>
+          <w:tcPr>
+            <w:tcW w:w="1752" w:type="dxa"/>
+          </w:tcPr>
+          <w:p>
+            <w:pPr/>
+            <w:r>
+              <w:t xml:space="preserve">Lunes 12:00 a 15:00</w:t>
+            </w:r>
+          </w:p>
+        </w:tc>
+        <w:tc>
+          <w:tcPr>
+            <w:tcW w:w="4920" w:type="dxa"/>
+          </w:tcPr>
+          <w:p>
+            <w:pPr/>
+            <w:r>
+              <w:t xml:space="preserve">Flujo completo de la demo en su teléfono, video de respaldo, tag </w:t>
+            </w:r>
             <w:r>
               <w:rPr>
                 <w:rStyle w:val="CodeChar"/>
               </w:rPr>
-              <w:t xml:space="preserve">mobile</w:t>
-            </w:r>
-          </w:p>
-        </w:tc>
-      </w:tr>
-      <w:tr>
-        <w:tc>
-          <w:tcPr>
-            <w:tcW w:w="4920" w:type="dxa"/>
-          </w:tcPr>
-          <w:p>
-            <w:pPr/>
-            <w:r>
-              <w:t xml:space="preserve">Prueba de modo avión de punta a punta</w:t>
-            </w:r>
-          </w:p>
-        </w:tc>
-        <w:tc>
-          <w:tcPr>
-            <w:tcW w:w="1542" w:type="dxa"/>
-          </w:tcPr>
-          <w:p>
-            <w:pPr/>
-            <w:r>
-              <w:t xml:space="preserve">Isabel</w:t>
-            </w:r>
-          </w:p>
-        </w:tc>
-        <w:tc>
-          <w:tcPr>
-            <w:tcW w:w="2898" w:type="dxa"/>
-          </w:tcPr>
-          <w:p>
-            <w:pPr/>
-            <w:r>
-              <w:rPr>
-                <w:rStyle w:val="CodeChar"/>
-              </w:rPr>
-              <w:t xml:space="preserve">api</w:t>
-            </w:r>
-            <w:r>
-              <w:t xml:space="preserve">, </w:t>
-            </w:r>
-            <w:r>
-              <w:rPr>
-                <w:rStyle w:val="CodeChar"/>
-              </w:rPr>
-              <w:t xml:space="preserve">watch</w:t>
+              <w:t xml:space="preserve">v1.0.0</w:t>
+            </w:r>
+          </w:p>
+        </w:tc>
+        <w:tc>
+          <w:tcPr>
+            <w:tcW w:w="2688" w:type="dxa"/>
+          </w:tcPr>
+          <w:p>
+            <w:pPr/>
+            <w:r>
+              <w:t xml:space="preserve">Proyecto listo</w:t>
             </w:r>
           </w:p>
         </w:tc>
       </w:tr>
     </w:tbl>
-    <w:p/>
+    <w:p>
+      <w:pPr>
+        <w:pStyle w:val="Heading3"/>
+      </w:pPr>
+      <w:r>
+        <w:t xml:space="preserve">Puntos de control</w:t>
+      </w:r>
+    </w:p>
+    <w:p>
+      <w:pPr>
+        <w:pStyle w:val="ListParagraph"/>
+        <w:numPr>
+          <w:ilvl w:val="0"/>
+          <w:numId w:val="21"/>
+        </w:numPr>
+      </w:pPr>
+      <w:r>
+        <w:t xml:space="preserve">☐ Domingo 25, 23:30: las dos apps arrancan en las computadoras de Kassie y Jeshua</w:t>
+      </w:r>
+    </w:p>
+    <w:p>
+      <w:pPr>
+        <w:pStyle w:val="ListParagraph"/>
+        <w:numPr>
+          <w:ilvl w:val="0"/>
+          <w:numId w:val="21"/>
+        </w:numPr>
+      </w:pPr>
+      <w:r>
+        <w:t xml:space="preserve">☐ Lunes 26, 10:00: emparejar, guardar sin conexión y verlo en el móvil funciona en emuladores; desde aquí solo se corrigen errores</w:t>
+      </w:r>
+    </w:p>
+    <w:p>
+      <w:pPr>
+        <w:pStyle w:val="ListParagraph"/>
+        <w:numPr>
+          <w:ilvl w:val="0"/>
+          <w:numId w:val="21"/>
+        </w:numPr>
+      </w:pPr>
+      <w:r>
+        <w:t xml:space="preserve">☐ Lunes 26, 13:00: demo completa en el teléfono de Isabel con los APK</w:t>
+      </w:r>
+    </w:p>
+    <w:p>
+      <w:pPr>
+        <w:pStyle w:val="ListParagraph"/>
+        <w:numPr>
+          <w:ilvl w:val="0"/>
+          <w:numId w:val="21"/>
+        </w:numPr>
+      </w:pPr>
+      <w:r>
+        <w:t xml:space="preserve">☐ Lunes 26, 15:00: tag </w:t>
+      </w:r>
+      <w:r>
+        <w:rPr>
+          <w:rStyle w:val="CodeChar"/>
+        </w:rPr>
+        <w:t xml:space="preserve">v1.0.0</w:t>
+      </w:r>
+      <w:r>
+        <w:t xml:space="preserve"> y video de respaldo: proyecto listo</w:t>
+      </w:r>
+    </w:p>
     <w:sectPr>
       <w:pgSz w:w="12240" w:h="15840"/>
       <w:pgMar w:top="1440" w:right="1440" w:bottom="1440" w:left="1440" w:header="720" w:footer="720" w:gutter="0"/>
@@ -7531,6 +8187,9 @@
     </w:lvlOverride>
   </w:num>
   <w:num w:numId="20">
+    <w:abstractNumId w:val="0"/>
+  </w:num>
+  <w:num w:numId="21">
     <w:abstractNumId w:val="0"/>
   </w:num>
 </w:numbering>

</xml_diff>

<commit_message>
docs: reparto por integrante y plan final (#2)
</commit_message>
<xml_diff>
--- a/docs/Arquitectura-y-flujo-de-trabajo-Where-I-Parked-It.docx
+++ b/docs/Arquitectura-y-flujo-de-trabajo-Where-I-Parked-It.docx
@@ -13,7 +13,7 @@
     <w:p>
       <w:pPr/>
       <w:r>
-        <w:t xml:space="preserve">Oct 23, 2026</w:t>
+        <w:t xml:space="preserve">Oct 25, 2026</w:t>
       </w:r>
       <w:r>
         <w:t xml:space="preserve"> · </w:t>
@@ -6404,13 +6404,22 @@
         <w:pStyle w:val="Heading2"/>
       </w:pPr>
       <w:r>
-        <w:t xml:space="preserve">7. Plan para el lunes</w:t>
+        <w:t xml:space="preserve">7. Reparto por integrante y plan final</w:t>
       </w:r>
     </w:p>
     <w:p>
       <w:pPr/>
       <w:r>
-        <w:t xml:space="preserve">El esqueleto ya trae la base de las tres apps, así que cada día se dedica a probar, corregir y pulir. El orden protege lo más riesgoso: el reloj primero, la integración el domingo y el lunes solo correcciones.</w:t>
+        <w:t xml:space="preserve">Cada integrante es dueño de un módulo (una carpeta del repo) y lo entrega funcionando el lunes 26 a las 15:00. Al domingo 25 a las 22:00, </w:t>
+      </w:r>
+      <w:r>
+        <w:rPr>
+          <w:rStyle w:val="CodeChar"/>
+        </w:rPr>
+        <w:t xml:space="preserve">main</w:t>
+      </w:r>
+      <w:r>
+        <w:t xml:space="preserve"> solo tiene el commit del esqueleto y no hay PRs, así que lo que queda se reparte desde esta noche.</w:t>
       </w:r>
     </w:p>
     <w:tbl>
@@ -6421,10 +6430,10 @@
         <w:tblLook w:val="04A0" w:firstRow="1" w:lastRow="0" w:firstColumn="0" w:lastColumn="0" w:noHBand="0" w:noVBand="1"/>
       </w:tblPr>
       <w:tblGrid>
-        <w:gridCol w:w="1661"/>
-        <w:gridCol w:w="2985"/>
-        <w:gridCol w:w="2410"/>
-        <w:gridCol w:w="2304"/>
+        <w:gridCol w:w="1266"/>
+        <w:gridCol w:w="2540"/>
+        <w:gridCol w:w="2342"/>
+        <w:gridCol w:w="3212"/>
       </w:tblGrid>
       <w:tr>
         <w:trPr>
@@ -6432,49 +6441,49 @@
         </w:trPr>
         <w:tc>
           <w:tcPr>
-            <w:tcW w:w="1661" w:type="dxa"/>
+            <w:tcW w:w="1266" w:type="dxa"/>
             <w:shd w:val="clear" w:color="auto" w:fill="F2F2F2"/>
           </w:tcPr>
           <w:p>
             <w:pPr/>
             <w:r>
-              <w:t xml:space="preserve">Día</w:t>
-            </w:r>
-          </w:p>
-        </w:tc>
-        <w:tc>
-          <w:tcPr>
-            <w:tcW w:w="2985" w:type="dxa"/>
+              <w:t xml:space="preserve">Integrante</w:t>
+            </w:r>
+          </w:p>
+        </w:tc>
+        <w:tc>
+          <w:tcPr>
+            <w:tcW w:w="2540" w:type="dxa"/>
             <w:shd w:val="clear" w:color="auto" w:fill="F2F2F2"/>
           </w:tcPr>
           <w:p>
             <w:pPr/>
             <w:r>
-              <w:t xml:space="preserve">Isabel (API y repo)</w:t>
-            </w:r>
-          </w:p>
-        </w:tc>
-        <w:tc>
-          <w:tcPr>
-            <w:tcW w:w="2410" w:type="dxa"/>
+              <w:t xml:space="preserve">Módulo</w:t>
+            </w:r>
+          </w:p>
+        </w:tc>
+        <w:tc>
+          <w:tcPr>
+            <w:tcW w:w="2342" w:type="dxa"/>
             <w:shd w:val="clear" w:color="auto" w:fill="F2F2F2"/>
           </w:tcPr>
           <w:p>
             <w:pPr/>
             <w:r>
-              <w:t xml:space="preserve">Jeshua (reloj)</w:t>
-            </w:r>
-          </w:p>
-        </w:tc>
-        <w:tc>
-          <w:tcPr>
-            <w:tcW w:w="2304" w:type="dxa"/>
+              <w:t xml:space="preserve">Carpeta</w:t>
+            </w:r>
+          </w:p>
+        </w:tc>
+        <w:tc>
+          <w:tcPr>
+            <w:tcW w:w="3212" w:type="dxa"/>
             <w:shd w:val="clear" w:color="auto" w:fill="F2F2F2"/>
           </w:tcPr>
           <w:p>
             <w:pPr/>
             <w:r>
-              <w:t xml:space="preserve">Kassie (móvil)</w:t>
+              <w:t xml:space="preserve">Pasos de la demo que le tocan</w:t>
             </w:r>
           </w:p>
         </w:tc>
@@ -6482,54 +6491,48 @@
       <w:tr>
         <w:tc>
           <w:tcPr>
-            <w:tcW w:w="1661" w:type="dxa"/>
-          </w:tcPr>
-          <w:p>
-            <w:pPr/>
-            <w:r>
-              <w:t xml:space="preserve">Vie 23, noche</w:t>
-            </w:r>
-          </w:p>
-        </w:tc>
-        <w:tc>
-          <w:tcPr>
-            <w:tcW w:w="2985" w:type="dxa"/>
-          </w:tcPr>
-          <w:p>
-            <w:pPr/>
-            <w:r>
-              <w:t xml:space="preserve">Primer push del esqueleto, colaboradores, ruleset, check </w:t>
-            </w:r>
+            <w:tcW w:w="1266" w:type="dxa"/>
+          </w:tcPr>
+          <w:p>
+            <w:pPr/>
+            <w:r>
+              <w:t xml:space="preserve">Jeshua</w:t>
+            </w:r>
+          </w:p>
+        </w:tc>
+        <w:tc>
+          <w:tcPr>
+            <w:tcW w:w="2540" w:type="dxa"/>
+          </w:tcPr>
+          <w:p>
+            <w:pPr/>
+            <w:r>
+              <w:t xml:space="preserve">Reloj Wear OS</w:t>
+            </w:r>
+          </w:p>
+        </w:tc>
+        <w:tc>
+          <w:tcPr>
+            <w:tcW w:w="2342" w:type="dxa"/>
+          </w:tcPr>
+          <w:p>
+            <w:pPr/>
             <w:r>
               <w:rPr>
                 <w:rStyle w:val="CodeChar"/>
               </w:rPr>
-              <w:t xml:space="preserve">ci</w:t>
-            </w:r>
-            <w:r>
-              <w:t xml:space="preserve">, etiquetas e issues</w:t>
-            </w:r>
-          </w:p>
-        </w:tc>
-        <w:tc>
-          <w:tcPr>
-            <w:tcW w:w="2410" w:type="dxa"/>
-          </w:tcPr>
-          <w:p>
-            <w:pPr/>
-            <w:r>
-              <w:t xml:space="preserve">Preparar computadora; correr la app del reloj en el emulador Wear OS</w:t>
-            </w:r>
-          </w:p>
-        </w:tc>
-        <w:tc>
-          <w:tcPr>
-            <w:tcW w:w="2304" w:type="dxa"/>
-          </w:tcPr>
-          <w:p>
-            <w:pPr/>
-            <w:r>
-              <w:t xml:space="preserve">Preparar computadora; correr la app móvil en Expo Go en el emulador</w:t>
+              <w:t xml:space="preserve">apps/watch</w:t>
+            </w:r>
+          </w:p>
+        </w:tc>
+        <w:tc>
+          <w:tcPr>
+            <w:tcW w:w="3212" w:type="dxa"/>
+          </w:tcPr>
+          <w:p>
+            <w:pPr/>
+            <w:r>
+              <w:t xml:space="preserve">2, 4 y 6</w:t>
             </w:r>
           </w:p>
         </w:tc>
@@ -6537,155 +6540,117 @@
       <w:tr>
         <w:tc>
           <w:tcPr>
-            <w:tcW w:w="1661" w:type="dxa"/>
-          </w:tcPr>
-          <w:p>
-            <w:pPr/>
-            <w:r>
-              <w:t xml:space="preserve">Sáb 24</w:t>
-            </w:r>
-          </w:p>
-        </w:tc>
-        <w:tc>
-          <w:tcPr>
-            <w:tcW w:w="2985" w:type="dxa"/>
-          </w:tcPr>
-          <w:p>
-            <w:pPr/>
-            <w:r>
-              <w:t xml:space="preserve">Desplegar API en Railway; clave de Google Maps; revisar PRs dos veces al día</w:t>
-            </w:r>
-          </w:p>
-        </w:tc>
-        <w:tc>
-          <w:tcPr>
-            <w:tcW w:w="2410" w:type="dxa"/>
-          </w:tcPr>
-          <w:p>
-            <w:pPr/>
-            <w:r>
-              <w:t xml:space="preserve">Guardar, brújula y emparejar funcionando en el emulador; ajustar la UI redonda</w:t>
-            </w:r>
-          </w:p>
-        </w:tc>
-        <w:tc>
-          <w:tcPr>
-            <w:tcW w:w="2304" w:type="dxa"/>
-          </w:tcPr>
-          <w:p>
-            <w:pPr/>
-            <w:r>
-              <w:t xml:space="preserve">Login, vehículos, historial y mapa contra la API; iconos de pestañas</w:t>
-            </w:r>
-          </w:p>
-        </w:tc>
-      </w:tr>
-      <w:tr>
-        <w:tc>
-          <w:tcPr>
-            <w:tcW w:w="1661" w:type="dxa"/>
-          </w:tcPr>
-          <w:p>
-            <w:pPr/>
-            <w:r>
-              <w:t xml:space="preserve">Dom 25</w:t>
-            </w:r>
-          </w:p>
-        </w:tc>
-        <w:tc>
-          <w:tcPr>
-            <w:tcW w:w="2985" w:type="dxa"/>
-          </w:tcPr>
-          <w:p>
-            <w:pPr/>
-            <w:r>
-              <w:t xml:space="preserve">Pruebas en tu teléfono; corregir errores de API y sync</w:t>
-            </w:r>
-          </w:p>
-        </w:tc>
-        <w:tc>
-          <w:tcPr>
-            <w:tcW w:w="2410" w:type="dxa"/>
-          </w:tcPr>
-          <w:p>
-            <w:pPr/>
-            <w:r>
-              <w:t xml:space="preserve">Prueba de modo avión de punta a punta; correcciones</w:t>
-            </w:r>
-          </w:p>
-        </w:tc>
-        <w:tc>
-          <w:tcPr>
-            <w:tcW w:w="2304" w:type="dxa"/>
-          </w:tcPr>
-          <w:p>
-            <w:pPr/>
-            <w:r>
-              <w:t xml:space="preserve">Diseño final, editar vehículos, filtro del historial</w:t>
-            </w:r>
-          </w:p>
-        </w:tc>
-      </w:tr>
-      <w:tr>
-        <w:tc>
-          <w:tcPr>
-            <w:tcW w:w="1661" w:type="dxa"/>
-          </w:tcPr>
-          <w:p>
-            <w:pPr/>
-            <w:r>
-              <w:t xml:space="preserve">Lun 26</w:t>
-            </w:r>
-          </w:p>
-        </w:tc>
-        <w:tc>
-          <w:tcPr>
-            <w:tcW w:w="2985" w:type="dxa"/>
-          </w:tcPr>
-          <w:p>
-            <w:pPr/>
-            <w:r>
-              <w:t xml:space="preserve">Build de APKs, flujo completo de la demo, video, tag </w:t>
-            </w:r>
+            <w:tcW w:w="1266" w:type="dxa"/>
+          </w:tcPr>
+          <w:p>
+            <w:pPr/>
+            <w:r>
+              <w:t xml:space="preserve">Kassie</w:t>
+            </w:r>
+          </w:p>
+        </w:tc>
+        <w:tc>
+          <w:tcPr>
+            <w:tcW w:w="2540" w:type="dxa"/>
+          </w:tcPr>
+          <w:p>
+            <w:pPr/>
+            <w:r>
+              <w:t xml:space="preserve">App móvil</w:t>
+            </w:r>
+          </w:p>
+        </w:tc>
+        <w:tc>
+          <w:tcPr>
+            <w:tcW w:w="2342" w:type="dxa"/>
+          </w:tcPr>
+          <w:p>
+            <w:pPr/>
             <w:r>
               <w:rPr>
                 <w:rStyle w:val="CodeChar"/>
               </w:rPr>
-              <w:t xml:space="preserve">v1.0.0</w:t>
-            </w:r>
-          </w:p>
-        </w:tc>
-        <w:tc>
-          <w:tcPr>
-            <w:tcW w:w="2410" w:type="dxa"/>
-          </w:tcPr>
-          <w:p>
-            <w:pPr/>
-            <w:r>
-              <w:t xml:space="preserve">Solo correcciones</w:t>
-            </w:r>
-          </w:p>
-        </w:tc>
-        <w:tc>
-          <w:tcPr>
-            <w:tcW w:w="2304" w:type="dxa"/>
-          </w:tcPr>
-          <w:p>
-            <w:pPr/>
-            <w:r>
-              <w:t xml:space="preserve">Solo correcciones</w:t>
+              <w:t xml:space="preserve">apps/mobile</w:t>
+            </w:r>
+          </w:p>
+        </w:tc>
+        <w:tc>
+          <w:tcPr>
+            <w:tcW w:w="3212" w:type="dxa"/>
+          </w:tcPr>
+          <w:p>
+            <w:pPr/>
+            <w:r>
+              <w:t xml:space="preserve">1, 3 y 5</w:t>
+            </w:r>
+          </w:p>
+        </w:tc>
+      </w:tr>
+      <w:tr>
+        <w:tc>
+          <w:tcPr>
+            <w:tcW w:w="1266" w:type="dxa"/>
+          </w:tcPr>
+          <w:p>
+            <w:pPr/>
+            <w:r>
+              <w:t xml:space="preserve">Isabel</w:t>
+            </w:r>
+          </w:p>
+        </w:tc>
+        <w:tc>
+          <w:tcPr>
+            <w:tcW w:w="2540" w:type="dxa"/>
+          </w:tcPr>
+          <w:p>
+            <w:pPr/>
+            <w:r>
+              <w:t xml:space="preserve">API, integración y entrega</w:t>
+            </w:r>
+          </w:p>
+        </w:tc>
+        <w:tc>
+          <w:tcPr>
+            <w:tcW w:w="2342" w:type="dxa"/>
+          </w:tcPr>
+          <w:p>
+            <w:pPr/>
+            <w:r>
+              <w:rPr>
+                <w:rStyle w:val="CodeChar"/>
+              </w:rPr>
+              <w:t xml:space="preserve">apps/api</w:t>
+            </w:r>
+            <w:r>
+              <w:t xml:space="preserve">, repo, </w:t>
+            </w:r>
+            <w:r>
+              <w:rPr>
+                <w:rStyle w:val="CodeChar"/>
+              </w:rPr>
+              <w:t xml:space="preserve">docs/</w:t>
+            </w:r>
+          </w:p>
+        </w:tc>
+        <w:tc>
+          <w:tcPr>
+            <w:tcW w:w="3212" w:type="dxa"/>
+          </w:tcPr>
+          <w:p>
+            <w:pPr/>
+            <w:r>
+              <w:t xml:space="preserve">Flujo completo en su teléfono</w:t>
             </w:r>
           </w:p>
         </w:tc>
       </w:tr>
     </w:tbl>
     <w:p>
-      <w:pPr/>
-      <w:r>
-        <w:rPr>
-          <w:b/>
-        </w:rPr>
-        <w:t xml:space="preserve">Puntos de control (todos):</w:t>
+      <w:pPr>
+        <w:pStyle w:val="Heading3"/>
+      </w:pPr>
+      <w:r>
+        <w:t xml:space="preserve">Reglas para las últimas horas</w:t>
       </w:r>
     </w:p>
     <w:p>
@@ -6697,16 +6662,13 @@
         </w:numPr>
       </w:pPr>
       <w:r>
-        <w:t xml:space="preserve">☐ Viernes 23, 23:00: el esqueleto está en </w:t>
-      </w:r>
-      <w:r>
-        <w:rPr>
-          <w:rStyle w:val="CodeChar"/>
-        </w:rPr>
-        <w:t xml:space="preserve">main</w:t>
-      </w:r>
-      <w:r>
-        <w:t xml:space="preserve"> y las tres apps arrancan en las tres computadoras</w:t>
+        <w:rPr>
+          <w:b/>
+        </w:rPr>
+        <w:t xml:space="preserve">Cada quien trabaja solo en su carpeta.</w:t>
+      </w:r>
+      <w:r>
+        <w:t xml:space="preserve"> Si alguien necesita cambiar algo en la carpeta de otra persona, primero avisa en el grupo.</w:t>
       </w:r>
     </w:p>
     <w:p>
@@ -6718,7 +6680,22 @@
         </w:numPr>
       </w:pPr>
       <w:r>
-        <w:t xml:space="preserve">☐ Sábado 24, 12:00: decisión sobre el reloj (seguir con React Native o plan B)</w:t>
+        <w:rPr>
+          <w:b/>
+        </w:rPr>
+        <w:t xml:space="preserve">La API solo la cambia Isabel.</w:t>
+      </w:r>
+      <w:r>
+        <w:t xml:space="preserve"> Si a la app móvil o al reloj les falta un dato, se pide; no se modifica </w:t>
+      </w:r>
+      <w:r>
+        <w:rPr>
+          <w:rStyle w:val="CodeChar"/>
+        </w:rPr>
+        <w:t xml:space="preserve">apps/api</w:t>
+      </w:r>
+      <w:r>
+        <w:t xml:space="preserve">.</w:t>
       </w:r>
     </w:p>
     <w:p>
@@ -6730,7 +6707,13 @@
         </w:numPr>
       </w:pPr>
       <w:r>
-        <w:t xml:space="preserve">☐ Sábado 24, 20:00: emparejar, guardar y ver en el móvil funciona en emuladores</w:t>
+        <w:rPr>
+          <w:b/>
+        </w:rPr>
+        <w:t xml:space="preserve">PRs pequeños y frecuentes.</w:t>
+      </w:r>
+      <w:r>
+        <w:t xml:space="preserve"> Isabel revisa el domingo a las 23:30 y después cada 2 horas el lunes.</w:t>
       </w:r>
     </w:p>
     <w:p>
@@ -6742,97 +6725,36 @@
         </w:numPr>
       </w:pPr>
       <w:r>
-        <w:t xml:space="preserve">☐ Domingo 25, 20:00: se congela </w:t>
-      </w:r>
-      <w:r>
-        <w:rPr>
-          <w:rStyle w:val="CodeChar"/>
-        </w:rPr>
-        <w:t xml:space="preserve">main</w:t>
-      </w:r>
-      <w:r>
-        <w:t xml:space="preserve">; la prueba de modo avión pasa en el teléfono de Isabel</w:t>
-      </w:r>
-    </w:p>
-    <w:p>
-      <w:pPr>
-        <w:pStyle w:val="ListParagraph"/>
-        <w:numPr>
-          <w:ilvl w:val="0"/>
-          <w:numId w:val="20"/>
-        </w:numPr>
-      </w:pPr>
-      <w:r>
-        <w:t xml:space="preserve">☐ Lunes 26, 12:00: APKs instalados y flujo de la demo completo</w:t>
-      </w:r>
-    </w:p>
-    <w:p>
-      <w:pPr>
-        <w:pStyle w:val="ListParagraph"/>
-        <w:numPr>
-          <w:ilvl w:val="0"/>
-          <w:numId w:val="20"/>
-        </w:numPr>
-      </w:pPr>
-      <w:r>
-        <w:t xml:space="preserve">☐ Lunes 26, 15:00: tag </w:t>
-      </w:r>
-      <w:r>
-        <w:rPr>
-          <w:rStyle w:val="CodeChar"/>
-        </w:rPr>
-        <w:t xml:space="preserve">v1.0.0</w:t>
-      </w:r>
-      <w:r>
-        <w:t xml:space="preserve"> y video de respaldo grabado: proyecto listo</w:t>
+        <w:rPr>
+          <w:b/>
+        </w:rPr>
+        <w:t xml:space="preserve">Ya no se agregan funciones:</w:t>
+      </w:r>
+      <w:r>
+        <w:t xml:space="preserve"> solo se hace funcionar lo que ya trae el esqueleto.</w:t>
+      </w:r>
+    </w:p>
+    <w:p>
+      <w:pPr>
+        <w:pStyle w:val="Heading3"/>
+      </w:pPr>
+      <w:r>
+        <w:t xml:space="preserve">Jeshua: módulo Reloj (</w:t>
+      </w:r>
+      <w:r>
+        <w:rPr>
+          <w:rStyle w:val="CodeChar"/>
+        </w:rPr>
+        <w:t xml:space="preserve">apps/watch</w:t>
+      </w:r>
+      <w:r>
+        <w:t xml:space="preserve">)</w:t>
       </w:r>
     </w:p>
     <w:p>
       <w:pPr/>
       <w:r>
-        <w:rPr>
-          <w:b/>
-        </w:rPr>
-        <w:t xml:space="preserve">Issues para crear hoy en GitHub</w:t>
-      </w:r>
-      <w:r>
-        <w:t xml:space="preserve"> (uno por fila; etiquetas </w:t>
-      </w:r>
-      <w:r>
-        <w:rPr>
-          <w:rStyle w:val="CodeChar"/>
-        </w:rPr>
-        <w:t xml:space="preserve">api</w:t>
-      </w:r>
-      <w:r>
-        <w:t xml:space="preserve">, </w:t>
-      </w:r>
-      <w:r>
-        <w:rPr>
-          <w:rStyle w:val="CodeChar"/>
-        </w:rPr>
-        <w:t xml:space="preserve">mobile</w:t>
-      </w:r>
-      <w:r>
-        <w:t xml:space="preserve">, </w:t>
-      </w:r>
-      <w:r>
-        <w:rPr>
-          <w:rStyle w:val="CodeChar"/>
-        </w:rPr>
-        <w:t xml:space="preserve">watch</w:t>
-      </w:r>
-      <w:r>
-        <w:t xml:space="preserve">, </w:t>
-      </w:r>
-      <w:r>
-        <w:rPr>
-          <w:rStyle w:val="CodeChar"/>
-        </w:rPr>
-        <w:t xml:space="preserve">probar-en-dispositivo</w:t>
-      </w:r>
-      <w:r>
-        <w:t xml:space="preserve">):</w:t>
+        <w:t xml:space="preserve">Es el módulo de mayor riesgo, así que va primero.</w:t>
       </w:r>
     </w:p>
     <w:tbl>
@@ -6843,9 +6765,10 @@
         <w:tblLook w:val="04A0" w:firstRow="1" w:lastRow="0" w:firstColumn="0" w:lastColumn="0" w:noHBand="0" w:noVBand="1"/>
       </w:tblPr>
       <w:tblGrid>
-        <w:gridCol w:w="4920"/>
-        <w:gridCol w:w="1542"/>
-        <w:gridCol w:w="2898"/>
+        <w:gridCol w:w="1471"/>
+        <w:gridCol w:w="2590"/>
+        <w:gridCol w:w="2340"/>
+        <w:gridCol w:w="2959"/>
       </w:tblGrid>
       <w:tr>
         <w:trPr>
@@ -6853,37 +6776,49 @@
         </w:trPr>
         <w:tc>
           <w:tcPr>
-            <w:tcW w:w="4920" w:type="dxa"/>
+            <w:tcW w:w="1471" w:type="dxa"/>
             <w:shd w:val="clear" w:color="auto" w:fill="F2F2F2"/>
           </w:tcPr>
           <w:p>
             <w:pPr/>
             <w:r>
-              <w:t xml:space="preserve">Issue</w:t>
-            </w:r>
-          </w:p>
-        </w:tc>
-        <w:tc>
-          <w:tcPr>
-            <w:tcW w:w="1542" w:type="dxa"/>
+              <w:t xml:space="preserve">Orden</w:t>
+            </w:r>
+          </w:p>
+        </w:tc>
+        <w:tc>
+          <w:tcPr>
+            <w:tcW w:w="2590" w:type="dxa"/>
             <w:shd w:val="clear" w:color="auto" w:fill="F2F2F2"/>
           </w:tcPr>
           <w:p>
             <w:pPr/>
             <w:r>
-              <w:t xml:space="preserve">Responsable</w:t>
-            </w:r>
-          </w:p>
-        </w:tc>
-        <w:tc>
-          <w:tcPr>
-            <w:tcW w:w="2898" w:type="dxa"/>
+              <w:t xml:space="preserve">Tarea</w:t>
+            </w:r>
+          </w:p>
+        </w:tc>
+        <w:tc>
+          <w:tcPr>
+            <w:tcW w:w="2340" w:type="dxa"/>
             <w:shd w:val="clear" w:color="auto" w:fill="F2F2F2"/>
           </w:tcPr>
           <w:p>
             <w:pPr/>
             <w:r>
-              <w:t xml:space="preserve">Etiqueta</w:t>
+              <w:t xml:space="preserve">Archivos</w:t>
+            </w:r>
+          </w:p>
+        </w:tc>
+        <w:tc>
+          <w:tcPr>
+            <w:tcW w:w="2959" w:type="dxa"/>
+            <w:shd w:val="clear" w:color="auto" w:fill="F2F2F2"/>
+          </w:tcPr>
+          <w:p>
+            <w:pPr/>
+            <w:r>
+              <w:t xml:space="preserve">Terminado cuando</w:t>
             </w:r>
           </w:p>
         </w:tc>
@@ -6891,67 +6826,35 @@
       <w:tr>
         <w:tc>
           <w:tcPr>
-            <w:tcW w:w="4920" w:type="dxa"/>
-          </w:tcPr>
-          <w:p>
-            <w:pPr/>
-            <w:r>
-              <w:t xml:space="preserve">Reloj corre en emulador Wear OS con el esqueleto</w:t>
-            </w:r>
-          </w:p>
-        </w:tc>
-        <w:tc>
-          <w:tcPr>
-            <w:tcW w:w="1542" w:type="dxa"/>
-          </w:tcPr>
-          <w:p>
-            <w:pPr/>
-            <w:r>
-              <w:t xml:space="preserve">Jeshua</w:t>
-            </w:r>
-          </w:p>
-        </w:tc>
-        <w:tc>
-          <w:tcPr>
-            <w:tcW w:w="2898" w:type="dxa"/>
-          </w:tcPr>
-          <w:p>
-            <w:pPr/>
+            <w:tcW w:w="1471" w:type="dxa"/>
+          </w:tcPr>
+          <w:p>
+            <w:pPr/>
+            <w:r>
+              <w:t xml:space="preserve">1 (domingo)</w:t>
+            </w:r>
+          </w:p>
+        </w:tc>
+        <w:tc>
+          <w:tcPr>
+            <w:tcW w:w="2590" w:type="dxa"/>
+          </w:tcPr>
+          <w:p>
+            <w:pPr/>
+            <w:r>
+              <w:t xml:space="preserve">Correr la app en el emulador Wear OS con </w:t>
+            </w:r>
             <w:r>
               <w:rPr>
                 <w:rStyle w:val="CodeChar"/>
               </w:rPr>
-              <w:t xml:space="preserve">watch</w:t>
-            </w:r>
-          </w:p>
-        </w:tc>
-      </w:tr>
-      <w:tr>
-        <w:tc>
-          <w:tcPr>
-            <w:tcW w:w="4920" w:type="dxa"/>
-          </w:tcPr>
-          <w:p>
-            <w:pPr/>
-            <w:r>
-              <w:t xml:space="preserve">Ajustar UI del reloj a pantalla redonda</w:t>
-            </w:r>
-          </w:p>
-        </w:tc>
-        <w:tc>
-          <w:tcPr>
-            <w:tcW w:w="1542" w:type="dxa"/>
-          </w:tcPr>
-          <w:p>
-            <w:pPr/>
-            <w:r>
-              <w:t xml:space="preserve">Jeshua</w:t>
-            </w:r>
-          </w:p>
-        </w:tc>
-        <w:tc>
-          <w:tcPr>
-            <w:tcW w:w="2898" w:type="dxa"/>
+              <w:t xml:space="preserve">npm run android</w:t>
+            </w:r>
+          </w:p>
+        </w:tc>
+        <w:tc>
+          <w:tcPr>
+            <w:tcW w:w="2340" w:type="dxa"/>
           </w:tcPr>
           <w:p>
             <w:pPr/>
@@ -6959,92 +6862,85 @@
               <w:rPr>
                 <w:rStyle w:val="CodeChar"/>
               </w:rPr>
-              <w:t xml:space="preserve">watch</w:t>
-            </w:r>
-          </w:p>
-        </w:tc>
-      </w:tr>
-      <w:tr>
-        <w:tc>
-          <w:tcPr>
-            <w:tcW w:w="4920" w:type="dxa"/>
-          </w:tcPr>
-          <w:p>
-            <w:pPr/>
-            <w:r>
-              <w:t xml:space="preserve">Validar brújula y distancia con ubicación simulada</w:t>
-            </w:r>
-          </w:p>
-        </w:tc>
-        <w:tc>
-          <w:tcPr>
-            <w:tcW w:w="1542" w:type="dxa"/>
-          </w:tcPr>
-          <w:p>
-            <w:pPr/>
-            <w:r>
-              <w:t xml:space="preserve">Jeshua</w:t>
-            </w:r>
-          </w:p>
-        </w:tc>
-        <w:tc>
-          <w:tcPr>
-            <w:tcW w:w="2898" w:type="dxa"/>
-          </w:tcPr>
-          <w:p>
-            <w:pPr/>
+              <w:t xml:space="preserve">app.json</w:t>
+            </w:r>
+            <w:r>
+              <w:t xml:space="preserve">, </w:t>
+            </w:r>
             <w:r>
               <w:rPr>
                 <w:rStyle w:val="CodeChar"/>
               </w:rPr>
-              <w:t xml:space="preserve">watch</w:t>
-            </w:r>
-            <w:r>
-              <w:t xml:space="preserve">, </w:t>
-            </w:r>
+              <w:t xml:space="preserve">plugins/withWearOS.js</w:t>
+            </w:r>
+          </w:p>
+        </w:tc>
+        <w:tc>
+          <w:tcPr>
+            <w:tcW w:w="2959" w:type="dxa"/>
+          </w:tcPr>
+          <w:p>
+            <w:pPr/>
+            <w:r>
+              <w:t xml:space="preserve">La pantalla de emparejar muestra un código</w:t>
+            </w:r>
+          </w:p>
+        </w:tc>
+      </w:tr>
+      <w:tr>
+        <w:tc>
+          <w:tcPr>
+            <w:tcW w:w="1471" w:type="dxa"/>
+          </w:tcPr>
+          <w:p>
+            <w:pPr/>
+            <w:r>
+              <w:t xml:space="preserve">2 (domingo)</w:t>
+            </w:r>
+          </w:p>
+        </w:tc>
+        <w:tc>
+          <w:tcPr>
+            <w:tcW w:w="2590" w:type="dxa"/>
+          </w:tcPr>
+          <w:p>
+            <w:pPr/>
+            <w:r>
+              <w:t xml:space="preserve">Emparejar con la API y sincronizar el vehículo</w:t>
+            </w:r>
+          </w:p>
+        </w:tc>
+        <w:tc>
+          <w:tcPr>
+            <w:tcW w:w="2340" w:type="dxa"/>
+          </w:tcPr>
+          <w:p>
+            <w:pPr/>
             <w:r>
               <w:rPr>
                 <w:rStyle w:val="CodeChar"/>
               </w:rPr>
-              <w:t xml:space="preserve">probar-en-dispositivo</w:t>
-            </w:r>
-          </w:p>
-        </w:tc>
-      </w:tr>
-      <w:tr>
-        <w:tc>
-          <w:tcPr>
-            <w:tcW w:w="4920" w:type="dxa"/>
-          </w:tcPr>
-          <w:p>
-            <w:pPr/>
-            <w:r>
-              <w:t xml:space="preserve">App móvil corre en Expo Go con login y vehículos</w:t>
-            </w:r>
-          </w:p>
-        </w:tc>
-        <w:tc>
-          <w:tcPr>
-            <w:tcW w:w="1542" w:type="dxa"/>
-          </w:tcPr>
-          <w:p>
-            <w:pPr/>
-            <w:r>
-              <w:t xml:space="preserve">Kassie</w:t>
-            </w:r>
-          </w:p>
-        </w:tc>
-        <w:tc>
-          <w:tcPr>
-            <w:tcW w:w="2898" w:type="dxa"/>
-          </w:tcPr>
-          <w:p>
-            <w:pPr/>
+              <w:t xml:space="preserve">src/screens/PairScreen.tsx</w:t>
+            </w:r>
+            <w:r>
+              <w:t xml:space="preserve">, </w:t>
+            </w:r>
             <w:r>
               <w:rPr>
                 <w:rStyle w:val="CodeChar"/>
               </w:rPr>
-              <w:t xml:space="preserve">mobile</w:t>
+              <w:t xml:space="preserve">src/sync.ts</w:t>
+            </w:r>
+          </w:p>
+        </w:tc>
+        <w:tc>
+          <w:tcPr>
+            <w:tcW w:w="2959" w:type="dxa"/>
+          </w:tcPr>
+          <w:p>
+            <w:pPr/>
+            <w:r>
+              <w:t xml:space="preserve">El inicio muestra el nombre del vehículo</w:t>
             </w:r>
           </w:p>
         </w:tc>
@@ -7052,29 +6948,29 @@
       <w:tr>
         <w:tc>
           <w:tcPr>
-            <w:tcW w:w="4920" w:type="dxa"/>
-          </w:tcPr>
-          <w:p>
-            <w:pPr/>
-            <w:r>
-              <w:t xml:space="preserve">Iconos, diseño y editar vehículos</w:t>
-            </w:r>
-          </w:p>
-        </w:tc>
-        <w:tc>
-          <w:tcPr>
-            <w:tcW w:w="1542" w:type="dxa"/>
-          </w:tcPr>
-          <w:p>
-            <w:pPr/>
-            <w:r>
-              <w:t xml:space="preserve">Kassie</w:t>
-            </w:r>
-          </w:p>
-        </w:tc>
-        <w:tc>
-          <w:tcPr>
-            <w:tcW w:w="2898" w:type="dxa"/>
+            <w:tcW w:w="1471" w:type="dxa"/>
+          </w:tcPr>
+          <w:p>
+            <w:pPr/>
+            <w:r>
+              <w:t xml:space="preserve">3</w:t>
+            </w:r>
+          </w:p>
+        </w:tc>
+        <w:tc>
+          <w:tcPr>
+            <w:tcW w:w="2590" w:type="dxa"/>
+          </w:tcPr>
+          <w:p>
+            <w:pPr/>
+            <w:r>
+              <w:t xml:space="preserve">Guardar con nivel en modo avión</w:t>
+            </w:r>
+          </w:p>
+        </w:tc>
+        <w:tc>
+          <w:tcPr>
+            <w:tcW w:w="2340" w:type="dxa"/>
           </w:tcPr>
           <w:p>
             <w:pPr/>
@@ -7082,92 +6978,85 @@
               <w:rPr>
                 <w:rStyle w:val="CodeChar"/>
               </w:rPr>
-              <w:t xml:space="preserve">mobile</w:t>
-            </w:r>
-          </w:p>
-        </w:tc>
-      </w:tr>
-      <w:tr>
-        <w:tc>
-          <w:tcPr>
-            <w:tcW w:w="4920" w:type="dxa"/>
-          </w:tcPr>
-          <w:p>
-            <w:pPr/>
-            <w:r>
-              <w:t xml:space="preserve">Mapa y permisos de ubicación en el teléfono real</w:t>
-            </w:r>
-          </w:p>
-        </w:tc>
-        <w:tc>
-          <w:tcPr>
-            <w:tcW w:w="1542" w:type="dxa"/>
-          </w:tcPr>
-          <w:p>
-            <w:pPr/>
-            <w:r>
-              <w:t xml:space="preserve">Kassie</w:t>
-            </w:r>
-          </w:p>
-        </w:tc>
-        <w:tc>
-          <w:tcPr>
-            <w:tcW w:w="2898" w:type="dxa"/>
-          </w:tcPr>
-          <w:p>
-            <w:pPr/>
+              <w:t xml:space="preserve">src/screens/SaveScreen.tsx</w:t>
+            </w:r>
+            <w:r>
+              <w:t xml:space="preserve">, </w:t>
+            </w:r>
             <w:r>
               <w:rPr>
                 <w:rStyle w:val="CodeChar"/>
               </w:rPr>
-              <w:t xml:space="preserve">mobile</w:t>
-            </w:r>
-            <w:r>
-              <w:t xml:space="preserve">, </w:t>
-            </w:r>
+              <w:t xml:space="preserve">src/db.ts</w:t>
+            </w:r>
+          </w:p>
+        </w:tc>
+        <w:tc>
+          <w:tcPr>
+            <w:tcW w:w="2959" w:type="dxa"/>
+          </w:tcPr>
+          <w:p>
+            <w:pPr/>
+            <w:r>
+              <w:t xml:space="preserve">Al quitar el modo avión, el estacionamiento aparece en el móvil</w:t>
+            </w:r>
+          </w:p>
+        </w:tc>
+      </w:tr>
+      <w:tr>
+        <w:tc>
+          <w:tcPr>
+            <w:tcW w:w="1471" w:type="dxa"/>
+          </w:tcPr>
+          <w:p>
+            <w:pPr/>
+            <w:r>
+              <w:t xml:space="preserve">4</w:t>
+            </w:r>
+          </w:p>
+        </w:tc>
+        <w:tc>
+          <w:tcPr>
+            <w:tcW w:w="2590" w:type="dxa"/>
+          </w:tcPr>
+          <w:p>
+            <w:pPr/>
+            <w:r>
+              <w:t xml:space="preserve">Flecha y distancia con ubicación simulada</w:t>
+            </w:r>
+          </w:p>
+        </w:tc>
+        <w:tc>
+          <w:tcPr>
+            <w:tcW w:w="2340" w:type="dxa"/>
+          </w:tcPr>
+          <w:p>
+            <w:pPr/>
             <w:r>
               <w:rPr>
                 <w:rStyle w:val="CodeChar"/>
               </w:rPr>
-              <w:t xml:space="preserve">probar-en-dispositivo</w:t>
-            </w:r>
-          </w:p>
-        </w:tc>
-      </w:tr>
-      <w:tr>
-        <w:tc>
-          <w:tcPr>
-            <w:tcW w:w="4920" w:type="dxa"/>
-          </w:tcPr>
-          <w:p>
-            <w:pPr/>
-            <w:r>
-              <w:t xml:space="preserve">Desplegar API y MySQL en Railway</w:t>
-            </w:r>
-          </w:p>
-        </w:tc>
-        <w:tc>
-          <w:tcPr>
-            <w:tcW w:w="1542" w:type="dxa"/>
-          </w:tcPr>
-          <w:p>
-            <w:pPr/>
-            <w:r>
-              <w:t xml:space="preserve">Isabel</w:t>
-            </w:r>
-          </w:p>
-        </w:tc>
-        <w:tc>
-          <w:tcPr>
-            <w:tcW w:w="2898" w:type="dxa"/>
-          </w:tcPr>
-          <w:p>
-            <w:pPr/>
+              <w:t xml:space="preserve">src/screens/FindScreen.tsx</w:t>
+            </w:r>
+            <w:r>
+              <w:t xml:space="preserve">, </w:t>
+            </w:r>
             <w:r>
               <w:rPr>
                 <w:rStyle w:val="CodeChar"/>
               </w:rPr>
-              <w:t xml:space="preserve">api</w:t>
+              <w:t xml:space="preserve">src/geo.ts</w:t>
+            </w:r>
+          </w:p>
+        </w:tc>
+        <w:tc>
+          <w:tcPr>
+            <w:tcW w:w="2959" w:type="dxa"/>
+          </w:tcPr>
+          <w:p>
+            <w:pPr/>
+            <w:r>
+              <w:t xml:space="preserve">La flecha gira y la distancia cambia al mover la ubicación</w:t>
             </w:r>
           </w:p>
         </w:tc>
@@ -7175,12 +7064,711 @@
       <w:tr>
         <w:tc>
           <w:tcPr>
+            <w:tcW w:w="1471" w:type="dxa"/>
+          </w:tcPr>
+          <w:p>
+            <w:pPr/>
+            <w:r>
+              <w:t xml:space="preserve">5</w:t>
+            </w:r>
+          </w:p>
+        </w:tc>
+        <w:tc>
+          <w:tcPr>
+            <w:tcW w:w="2590" w:type="dxa"/>
+          </w:tcPr>
+          <w:p>
+            <w:pPr/>
+            <w:r>
+              <w:t xml:space="preserve">Ajustar la interfaz a la pantalla redonda</w:t>
+            </w:r>
+          </w:p>
+        </w:tc>
+        <w:tc>
+          <w:tcPr>
+            <w:tcW w:w="2340" w:type="dxa"/>
+          </w:tcPr>
+          <w:p>
+            <w:pPr/>
+            <w:r>
+              <w:rPr>
+                <w:rStyle w:val="CodeChar"/>
+              </w:rPr>
+              <w:t xml:space="preserve">src/ui.tsx</w:t>
+            </w:r>
+          </w:p>
+        </w:tc>
+        <w:tc>
+          <w:tcPr>
+            <w:tcW w:w="2959" w:type="dxa"/>
+          </w:tcPr>
+          <w:p>
+            <w:pPr/>
+            <w:r>
+              <w:t xml:space="preserve">Ningún texto o botón queda recortado</w:t>
+            </w:r>
+          </w:p>
+        </w:tc>
+      </w:tr>
+    </w:tbl>
+    <w:p>
+      <w:pPr/>
+      <w:r>
+        <w:t xml:space="preserve">Ramas: </w:t>
+      </w:r>
+      <w:r>
+        <w:rPr>
+          <w:rStyle w:val="CodeChar"/>
+        </w:rPr>
+        <w:t xml:space="preserve">feat/watch-emulador</w:t>
+      </w:r>
+      <w:r>
+        <w:t xml:space="preserve"> y </w:t>
+      </w:r>
+      <w:r>
+        <w:rPr>
+          <w:rStyle w:val="CodeChar"/>
+        </w:rPr>
+        <w:t xml:space="preserve">feat/watch-ui-redonda</w:t>
+      </w:r>
+      <w:r>
+        <w:t xml:space="preserve">. Si el paso 1 no funciona el domingo antes de las 00:00, Jeshua avisa en ese momento para resolverlo con Isabel el lunes a las 8:00.</w:t>
+      </w:r>
+    </w:p>
+    <w:p>
+      <w:pPr>
+        <w:pStyle w:val="Heading3"/>
+      </w:pPr>
+      <w:r>
+        <w:t xml:space="preserve">Kassie: módulo Móvil (</w:t>
+      </w:r>
+      <w:r>
+        <w:rPr>
+          <w:rStyle w:val="CodeChar"/>
+        </w:rPr>
+        <w:t xml:space="preserve">apps/mobile</w:t>
+      </w:r>
+      <w:r>
+        <w:t xml:space="preserve">)</w:t>
+      </w:r>
+    </w:p>
+    <w:tbl>
+      <w:tblPr>
+        <w:tblStyle w:val="TableGrid"/>
+        <w:tblW w:w="0" w:type="auto"/>
+        <w:tblLayout w:type="fixed"/>
+        <w:tblLook w:val="04A0" w:firstRow="1" w:lastRow="0" w:firstColumn="0" w:lastColumn="0" w:noHBand="0" w:noVBand="1"/>
+      </w:tblPr>
+      <w:tblGrid>
+        <w:gridCol w:w="1471"/>
+        <w:gridCol w:w="2663"/>
+        <w:gridCol w:w="2585"/>
+        <w:gridCol w:w="2641"/>
+      </w:tblGrid>
+      <w:tr>
+        <w:trPr>
+          <w:tblHeader/>
+        </w:trPr>
+        <w:tc>
+          <w:tcPr>
+            <w:tcW w:w="1471" w:type="dxa"/>
+            <w:shd w:val="clear" w:color="auto" w:fill="F2F2F2"/>
+          </w:tcPr>
+          <w:p>
+            <w:pPr/>
+            <w:r>
+              <w:t xml:space="preserve">Orden</w:t>
+            </w:r>
+          </w:p>
+        </w:tc>
+        <w:tc>
+          <w:tcPr>
+            <w:tcW w:w="2663" w:type="dxa"/>
+            <w:shd w:val="clear" w:color="auto" w:fill="F2F2F2"/>
+          </w:tcPr>
+          <w:p>
+            <w:pPr/>
+            <w:r>
+              <w:t xml:space="preserve">Tarea</w:t>
+            </w:r>
+          </w:p>
+        </w:tc>
+        <w:tc>
+          <w:tcPr>
+            <w:tcW w:w="2585" w:type="dxa"/>
+            <w:shd w:val="clear" w:color="auto" w:fill="F2F2F2"/>
+          </w:tcPr>
+          <w:p>
+            <w:pPr/>
+            <w:r>
+              <w:t xml:space="preserve">Archivos</w:t>
+            </w:r>
+          </w:p>
+        </w:tc>
+        <w:tc>
+          <w:tcPr>
+            <w:tcW w:w="2641" w:type="dxa"/>
+            <w:shd w:val="clear" w:color="auto" w:fill="F2F2F2"/>
+          </w:tcPr>
+          <w:p>
+            <w:pPr/>
+            <w:r>
+              <w:t xml:space="preserve">Terminado cuando</w:t>
+            </w:r>
+          </w:p>
+        </w:tc>
+      </w:tr>
+      <w:tr>
+        <w:tc>
+          <w:tcPr>
+            <w:tcW w:w="1471" w:type="dxa"/>
+          </w:tcPr>
+          <w:p>
+            <w:pPr/>
+            <w:r>
+              <w:t xml:space="preserve">1 (domingo)</w:t>
+            </w:r>
+          </w:p>
+        </w:tc>
+        <w:tc>
+          <w:tcPr>
+            <w:tcW w:w="2663" w:type="dxa"/>
+          </w:tcPr>
+          <w:p>
+            <w:pPr/>
+            <w:r>
+              <w:t xml:space="preserve">Correr la app en Expo Go en el emulador con </w:t>
+            </w:r>
+            <w:r>
+              <w:rPr>
+                <w:rStyle w:val="CodeChar"/>
+              </w:rPr>
+              <w:t xml:space="preserve">npm start</w:t>
+            </w:r>
+            <w:r>
+              <w:t xml:space="preserve"> + tecla </w:t>
+            </w:r>
+            <w:r>
+              <w:rPr>
+                <w:rStyle w:val="CodeChar"/>
+              </w:rPr>
+              <w:t xml:space="preserve">a</w:t>
+            </w:r>
+          </w:p>
+        </w:tc>
+        <w:tc>
+          <w:tcPr>
+            <w:tcW w:w="2585" w:type="dxa"/>
+          </w:tcPr>
+          <w:p>
+            <w:pPr/>
+            <w:r>
+              <w:rPr>
+                <w:rStyle w:val="CodeChar"/>
+              </w:rPr>
+              <w:t xml:space="preserve">.env</w:t>
+            </w:r>
+          </w:p>
+        </w:tc>
+        <w:tc>
+          <w:tcPr>
+            <w:tcW w:w="2641" w:type="dxa"/>
+          </w:tcPr>
+          <w:p>
+            <w:pPr/>
+            <w:r>
+              <w:t xml:space="preserve">Aparece la pantalla de login</w:t>
+            </w:r>
+          </w:p>
+        </w:tc>
+      </w:tr>
+      <w:tr>
+        <w:tc>
+          <w:tcPr>
+            <w:tcW w:w="1471" w:type="dxa"/>
+          </w:tcPr>
+          <w:p>
+            <w:pPr/>
+            <w:r>
+              <w:t xml:space="preserve">2 (domingo)</w:t>
+            </w:r>
+          </w:p>
+        </w:tc>
+        <w:tc>
+          <w:tcPr>
+            <w:tcW w:w="2663" w:type="dxa"/>
+          </w:tcPr>
+          <w:p>
+            <w:pPr/>
+            <w:r>
+              <w:t xml:space="preserve">Registro, login y vehículos</w:t>
+            </w:r>
+          </w:p>
+        </w:tc>
+        <w:tc>
+          <w:tcPr>
+            <w:tcW w:w="2585" w:type="dxa"/>
+          </w:tcPr>
+          <w:p>
+            <w:pPr/>
+            <w:r>
+              <w:rPr>
+                <w:rStyle w:val="CodeChar"/>
+              </w:rPr>
+              <w:t xml:space="preserve">src/app/login.tsx</w:t>
+            </w:r>
+            <w:r>
+              <w:t xml:space="preserve">, </w:t>
+            </w:r>
+            <w:r>
+              <w:rPr>
+                <w:rStyle w:val="CodeChar"/>
+              </w:rPr>
+              <w:t xml:space="preserve">src/app/(tabs)/vehiculos.tsx</w:t>
+            </w:r>
+          </w:p>
+        </w:tc>
+        <w:tc>
+          <w:tcPr>
+            <w:tcW w:w="2641" w:type="dxa"/>
+          </w:tcPr>
+          <w:p>
+            <w:pPr/>
+            <w:r>
+              <w:t xml:space="preserve">Puede crear una cuenta y agregar un vehículo</w:t>
+            </w:r>
+          </w:p>
+        </w:tc>
+      </w:tr>
+      <w:tr>
+        <w:tc>
+          <w:tcPr>
+            <w:tcW w:w="1471" w:type="dxa"/>
+          </w:tcPr>
+          <w:p>
+            <w:pPr/>
+            <w:r>
+              <w:t xml:space="preserve">3</w:t>
+            </w:r>
+          </w:p>
+        </w:tc>
+        <w:tc>
+          <w:tcPr>
+            <w:tcW w:w="2663" w:type="dxa"/>
+          </w:tcPr>
+          <w:p>
+            <w:pPr/>
+            <w:r>
+              <w:t xml:space="preserve">"Mi coche" con mapa y "Ya lo recogí"</w:t>
+            </w:r>
+          </w:p>
+        </w:tc>
+        <w:tc>
+          <w:tcPr>
+            <w:tcW w:w="2585" w:type="dxa"/>
+          </w:tcPr>
+          <w:p>
+            <w:pPr/>
+            <w:r>
+              <w:rPr>
+                <w:rStyle w:val="CodeChar"/>
+              </w:rPr>
+              <w:t xml:space="preserve">src/app/(tabs)/index.tsx</w:t>
+            </w:r>
+          </w:p>
+        </w:tc>
+        <w:tc>
+          <w:tcPr>
+            <w:tcW w:w="2641" w:type="dxa"/>
+          </w:tcPr>
+          <w:p>
+            <w:pPr/>
+            <w:r>
+              <w:t xml:space="preserve">Se ve el marcador de lo que guardó el reloj</w:t>
+            </w:r>
+          </w:p>
+        </w:tc>
+      </w:tr>
+      <w:tr>
+        <w:tc>
+          <w:tcPr>
+            <w:tcW w:w="1471" w:type="dxa"/>
+          </w:tcPr>
+          <w:p>
+            <w:pPr/>
+            <w:r>
+              <w:t xml:space="preserve">4</w:t>
+            </w:r>
+          </w:p>
+        </w:tc>
+        <w:tc>
+          <w:tcPr>
+            <w:tcW w:w="2663" w:type="dxa"/>
+          </w:tcPr>
+          <w:p>
+            <w:pPr/>
+            <w:r>
+              <w:t xml:space="preserve">Historial y emparejar reloj</w:t>
+            </w:r>
+          </w:p>
+        </w:tc>
+        <w:tc>
+          <w:tcPr>
+            <w:tcW w:w="2585" w:type="dxa"/>
+          </w:tcPr>
+          <w:p>
+            <w:pPr/>
+            <w:r>
+              <w:rPr>
+                <w:rStyle w:val="CodeChar"/>
+              </w:rPr>
+              <w:t xml:space="preserve">src/app/(tabs)/historial.tsx</w:t>
+            </w:r>
+            <w:r>
+              <w:t xml:space="preserve">, </w:t>
+            </w:r>
+            <w:r>
+              <w:rPr>
+                <w:rStyle w:val="CodeChar"/>
+              </w:rPr>
+              <w:t xml:space="preserve">src/app/(tabs)/ajustes.tsx</w:t>
+            </w:r>
+          </w:p>
+        </w:tc>
+        <w:tc>
+          <w:tcPr>
+            <w:tcW w:w="2641" w:type="dxa"/>
+          </w:tcPr>
+          <w:p>
+            <w:pPr/>
+            <w:r>
+              <w:t xml:space="preserve">El código del reloj se confirma desde aquí</w:t>
+            </w:r>
+          </w:p>
+        </w:tc>
+      </w:tr>
+      <w:tr>
+        <w:tc>
+          <w:tcPr>
+            <w:tcW w:w="1471" w:type="dxa"/>
+          </w:tcPr>
+          <w:p>
+            <w:pPr/>
+            <w:r>
+              <w:t xml:space="preserve">5</w:t>
+            </w:r>
+          </w:p>
+        </w:tc>
+        <w:tc>
+          <w:tcPr>
+            <w:tcW w:w="2663" w:type="dxa"/>
+          </w:tcPr>
+          <w:p>
+            <w:pPr/>
+            <w:r>
+              <w:t xml:space="preserve">Diseño: iconos de pestañas, colores y espacios</w:t>
+            </w:r>
+          </w:p>
+        </w:tc>
+        <w:tc>
+          <w:tcPr>
+            <w:tcW w:w="2585" w:type="dxa"/>
+          </w:tcPr>
+          <w:p>
+            <w:pPr/>
+            <w:r>
+              <w:rPr>
+                <w:rStyle w:val="CodeChar"/>
+              </w:rPr>
+              <w:t xml:space="preserve">src/lib/ui.tsx</w:t>
+            </w:r>
+            <w:r>
+              <w:t xml:space="preserve">, </w:t>
+            </w:r>
+            <w:r>
+              <w:rPr>
+                <w:rStyle w:val="CodeChar"/>
+              </w:rPr>
+              <w:t xml:space="preserve">src/app/(tabs)/_layout.tsx</w:t>
+            </w:r>
+          </w:p>
+        </w:tc>
+        <w:tc>
+          <w:tcPr>
+            <w:tcW w:w="2641" w:type="dxa"/>
+          </w:tcPr>
+          <w:p>
+            <w:pPr/>
+            <w:r>
+              <w:t xml:space="preserve">Se ve presentable para la demo</w:t>
+            </w:r>
+          </w:p>
+        </w:tc>
+      </w:tr>
+    </w:tbl>
+    <w:p>
+      <w:pPr/>
+      <w:r>
+        <w:t xml:space="preserve">Ramas: </w:t>
+      </w:r>
+      <w:r>
+        <w:rPr>
+          <w:rStyle w:val="CodeChar"/>
+        </w:rPr>
+        <w:t xml:space="preserve">feat/mobile-flujo</w:t>
+      </w:r>
+      <w:r>
+        <w:t xml:space="preserve"> y </w:t>
+      </w:r>
+      <w:r>
+        <w:rPr>
+          <w:rStyle w:val="CodeChar"/>
+        </w:rPr>
+        <w:t xml:space="preserve">feat/mobile-diseno</w:t>
+      </w:r>
+      <w:r>
+        <w:t xml:space="preserve">. Editar vehículos solo si sobra tiempo.</w:t>
+      </w:r>
+    </w:p>
+    <w:p>
+      <w:pPr>
+        <w:pStyle w:val="Heading3"/>
+      </w:pPr>
+      <w:r>
+        <w:t xml:space="preserve">Isabel: API, integración y entrega (</w:t>
+      </w:r>
+      <w:r>
+        <w:rPr>
+          <w:rStyle w:val="CodeChar"/>
+        </w:rPr>
+        <w:t xml:space="preserve">apps/api</w:t>
+      </w:r>
+      <w:r>
+        <w:t xml:space="preserve">, repo, </w:t>
+      </w:r>
+      <w:r>
+        <w:rPr>
+          <w:rStyle w:val="CodeChar"/>
+        </w:rPr>
+        <w:t xml:space="preserve">docs/</w:t>
+      </w:r>
+      <w:r>
+        <w:t xml:space="preserve">)</w:t>
+      </w:r>
+    </w:p>
+    <w:tbl>
+      <w:tblPr>
+        <w:tblStyle w:val="TableGrid"/>
+        <w:tblW w:w="0" w:type="auto"/>
+        <w:tblLayout w:type="fixed"/>
+        <w:tblLook w:val="04A0" w:firstRow="1" w:lastRow="0" w:firstColumn="0" w:lastColumn="0" w:noHBand="0" w:noVBand="1"/>
+      </w:tblPr>
+      <w:tblGrid>
+        <w:gridCol w:w="1752"/>
+        <w:gridCol w:w="4920"/>
+        <w:gridCol w:w="2688"/>
+      </w:tblGrid>
+      <w:tr>
+        <w:trPr>
+          <w:tblHeader/>
+        </w:trPr>
+        <w:tc>
+          <w:tcPr>
+            <w:tcW w:w="1752" w:type="dxa"/>
+            <w:shd w:val="clear" w:color="auto" w:fill="F2F2F2"/>
+          </w:tcPr>
+          <w:p>
+            <w:pPr/>
+            <w:r>
+              <w:t xml:space="preserve">Cuándo</w:t>
+            </w:r>
+          </w:p>
+        </w:tc>
+        <w:tc>
+          <w:tcPr>
             <w:tcW w:w="4920" w:type="dxa"/>
-          </w:tcPr>
-          <w:p>
-            <w:pPr/>
-            <w:r>
-              <w:t xml:space="preserve">Clave de Google Maps y perfil </w:t>
+            <w:shd w:val="clear" w:color="auto" w:fill="F2F2F2"/>
+          </w:tcPr>
+          <w:p>
+            <w:pPr/>
+            <w:r>
+              <w:t xml:space="preserve">Tarea</w:t>
+            </w:r>
+          </w:p>
+        </w:tc>
+        <w:tc>
+          <w:tcPr>
+            <w:tcW w:w="2688" w:type="dxa"/>
+            <w:shd w:val="clear" w:color="auto" w:fill="F2F2F2"/>
+          </w:tcPr>
+          <w:p>
+            <w:pPr/>
+            <w:r>
+              <w:t xml:space="preserve">Terminado cuando</w:t>
+            </w:r>
+          </w:p>
+        </w:tc>
+      </w:tr>
+      <w:tr>
+        <w:tc>
+          <w:tcPr>
+            <w:tcW w:w="1752" w:type="dxa"/>
+          </w:tcPr>
+          <w:p>
+            <w:pPr/>
+            <w:r>
+              <w:t xml:space="preserve">Domingo, antes de que el equipo empiece</w:t>
+            </w:r>
+          </w:p>
+        </w:tc>
+        <w:tc>
+          <w:tcPr>
+            <w:tcW w:w="4920" w:type="dxa"/>
+          </w:tcPr>
+          <w:p>
+            <w:pPr/>
+            <w:r>
+              <w:t xml:space="preserve">Ruleset de </w:t>
+            </w:r>
+            <w:r>
+              <w:rPr>
+                <w:rStyle w:val="CodeChar"/>
+              </w:rPr>
+              <w:t xml:space="preserve">main</w:t>
+            </w:r>
+            <w:r>
+              <w:t xml:space="preserve"> y colaboradores (sección 5.2), si aún no está; levantar la API</w:t>
+            </w:r>
+          </w:p>
+        </w:tc>
+        <w:tc>
+          <w:tcPr>
+            <w:tcW w:w="2688" w:type="dxa"/>
+          </w:tcPr>
+          <w:p>
+            <w:pPr/>
+            <w:r>
+              <w:t xml:space="preserve">Kassie y Jeshua pueden abrir PRs y ver </w:t>
+            </w:r>
+            <w:r>
+              <w:rPr>
+                <w:rStyle w:val="CodeChar"/>
+              </w:rPr>
+              <w:t xml:space="preserve">/health</w:t>
+            </w:r>
+          </w:p>
+        </w:tc>
+      </w:tr>
+      <w:tr>
+        <w:tc>
+          <w:tcPr>
+            <w:tcW w:w="1752" w:type="dxa"/>
+          </w:tcPr>
+          <w:p>
+            <w:pPr/>
+            <w:r>
+              <w:t xml:space="preserve">Domingo</w:t>
+            </w:r>
+          </w:p>
+        </w:tc>
+        <w:tc>
+          <w:tcPr>
+            <w:tcW w:w="4920" w:type="dxa"/>
+          </w:tcPr>
+          <w:p>
+            <w:pPr/>
+            <w:r>
+              <w:t xml:space="preserve">Si sus computadoras no aguantan Docker, desplegar la API en Railway y pasarles la URL</w:t>
+            </w:r>
+          </w:p>
+        </w:tc>
+        <w:tc>
+          <w:tcPr>
+            <w:tcW w:w="2688" w:type="dxa"/>
+          </w:tcPr>
+          <w:p>
+            <w:pPr/>
+            <w:r>
+              <w:t xml:space="preserve">Los dos usan la misma API</w:t>
+            </w:r>
+          </w:p>
+        </w:tc>
+      </w:tr>
+      <w:tr>
+        <w:tc>
+          <w:tcPr>
+            <w:tcW w:w="1752" w:type="dxa"/>
+          </w:tcPr>
+          <w:p>
+            <w:pPr/>
+            <w:r>
+              <w:t xml:space="preserve">Domingo 23:30 y lunes cada 2 h</w:t>
+            </w:r>
+          </w:p>
+        </w:tc>
+        <w:tc>
+          <w:tcPr>
+            <w:tcW w:w="4920" w:type="dxa"/>
+          </w:tcPr>
+          <w:p>
+            <w:pPr/>
+            <w:r>
+              <w:t xml:space="preserve">Revisar y hacer merge de PRs; corregir los errores de API que reporten</w:t>
+            </w:r>
+          </w:p>
+        </w:tc>
+        <w:tc>
+          <w:tcPr>
+            <w:tcW w:w="2688" w:type="dxa"/>
+          </w:tcPr>
+          <w:p>
+            <w:pPr/>
+            <w:r>
+              <w:t xml:space="preserve">Ningún PR espera más de 2 h</w:t>
+            </w:r>
+          </w:p>
+        </w:tc>
+      </w:tr>
+      <w:tr>
+        <w:tc>
+          <w:tcPr>
+            <w:tcW w:w="1752" w:type="dxa"/>
+          </w:tcPr>
+          <w:p>
+            <w:pPr/>
+            <w:r>
+              <w:t xml:space="preserve">Lunes 8:00</w:t>
+            </w:r>
+          </w:p>
+        </w:tc>
+        <w:tc>
+          <w:tcPr>
+            <w:tcW w:w="4920" w:type="dxa"/>
+          </w:tcPr>
+          <w:p>
+            <w:pPr/>
+            <w:r>
+              <w:t xml:space="preserve">Clave de Google Maps y URL de la API en </w:t>
+            </w:r>
+            <w:r>
+              <w:rPr>
+                <w:rStyle w:val="CodeChar"/>
+              </w:rPr>
+              <w:t xml:space="preserve">eas.json</w:t>
+            </w:r>
+            <w:r>
+              <w:t xml:space="preserve"> de las dos apps</w:t>
+            </w:r>
+          </w:p>
+        </w:tc>
+        <w:tc>
+          <w:tcPr>
+            <w:tcW w:w="2688" w:type="dxa"/>
+          </w:tcPr>
+          <w:p>
+            <w:pPr/>
+            <w:r>
+              <w:t xml:space="preserve">El perfil </w:t>
             </w:r>
             <w:r>
               <w:rPr>
@@ -7189,85 +7777,153 @@
               <w:t xml:space="preserve">preview</w:t>
             </w:r>
             <w:r>
-              <w:t xml:space="preserve"> de EAS</w:t>
-            </w:r>
-          </w:p>
-        </w:tc>
-        <w:tc>
-          <w:tcPr>
-            <w:tcW w:w="1542" w:type="dxa"/>
-          </w:tcPr>
-          <w:p>
-            <w:pPr/>
-            <w:r>
-              <w:t xml:space="preserve">Isabel</w:t>
-            </w:r>
-          </w:p>
-        </w:tc>
-        <w:tc>
-          <w:tcPr>
-            <w:tcW w:w="2898" w:type="dxa"/>
-          </w:tcPr>
-          <w:p>
-            <w:pPr/>
+              <w:t xml:space="preserve"> está listo</w:t>
+            </w:r>
+          </w:p>
+        </w:tc>
+      </w:tr>
+      <w:tr>
+        <w:tc>
+          <w:tcPr>
+            <w:tcW w:w="1752" w:type="dxa"/>
+          </w:tcPr>
+          <w:p>
+            <w:pPr/>
+            <w:r>
+              <w:t xml:space="preserve">Lunes 10:00</w:t>
+            </w:r>
+          </w:p>
+        </w:tc>
+        <w:tc>
+          <w:tcPr>
+            <w:tcW w:w="4920" w:type="dxa"/>
+          </w:tcPr>
+          <w:p>
+            <w:pPr/>
+            <w:r>
+              <w:t xml:space="preserve">Lanzar los builds de los dos APK con EAS (respaldo: build local)</w:t>
+            </w:r>
+          </w:p>
+        </w:tc>
+        <w:tc>
+          <w:tcPr>
+            <w:tcW w:w="2688" w:type="dxa"/>
+          </w:tcPr>
+          <w:p>
+            <w:pPr/>
+            <w:r>
+              <w:t xml:space="preserve">APKs instalados en su teléfono y en el emulador</w:t>
+            </w:r>
+          </w:p>
+        </w:tc>
+      </w:tr>
+      <w:tr>
+        <w:tc>
+          <w:tcPr>
+            <w:tcW w:w="1752" w:type="dxa"/>
+          </w:tcPr>
+          <w:p>
+            <w:pPr/>
+            <w:r>
+              <w:t xml:space="preserve">Lunes 12:00 a 15:00</w:t>
+            </w:r>
+          </w:p>
+        </w:tc>
+        <w:tc>
+          <w:tcPr>
+            <w:tcW w:w="4920" w:type="dxa"/>
+          </w:tcPr>
+          <w:p>
+            <w:pPr/>
+            <w:r>
+              <w:t xml:space="preserve">Flujo completo de la demo en su teléfono, video de respaldo, tag </w:t>
+            </w:r>
             <w:r>
               <w:rPr>
                 <w:rStyle w:val="CodeChar"/>
               </w:rPr>
-              <w:t xml:space="preserve">mobile</w:t>
-            </w:r>
-          </w:p>
-        </w:tc>
-      </w:tr>
-      <w:tr>
-        <w:tc>
-          <w:tcPr>
-            <w:tcW w:w="4920" w:type="dxa"/>
-          </w:tcPr>
-          <w:p>
-            <w:pPr/>
-            <w:r>
-              <w:t xml:space="preserve">Prueba de modo avión de punta a punta</w:t>
-            </w:r>
-          </w:p>
-        </w:tc>
-        <w:tc>
-          <w:tcPr>
-            <w:tcW w:w="1542" w:type="dxa"/>
-          </w:tcPr>
-          <w:p>
-            <w:pPr/>
-            <w:r>
-              <w:t xml:space="preserve">Isabel</w:t>
-            </w:r>
-          </w:p>
-        </w:tc>
-        <w:tc>
-          <w:tcPr>
-            <w:tcW w:w="2898" w:type="dxa"/>
-          </w:tcPr>
-          <w:p>
-            <w:pPr/>
-            <w:r>
-              <w:rPr>
-                <w:rStyle w:val="CodeChar"/>
-              </w:rPr>
-              <w:t xml:space="preserve">api</w:t>
-            </w:r>
-            <w:r>
-              <w:t xml:space="preserve">, </w:t>
-            </w:r>
-            <w:r>
-              <w:rPr>
-                <w:rStyle w:val="CodeChar"/>
-              </w:rPr>
-              <w:t xml:space="preserve">watch</w:t>
+              <w:t xml:space="preserve">v1.0.0</w:t>
+            </w:r>
+          </w:p>
+        </w:tc>
+        <w:tc>
+          <w:tcPr>
+            <w:tcW w:w="2688" w:type="dxa"/>
+          </w:tcPr>
+          <w:p>
+            <w:pPr/>
+            <w:r>
+              <w:t xml:space="preserve">Proyecto listo</w:t>
             </w:r>
           </w:p>
         </w:tc>
       </w:tr>
     </w:tbl>
-    <w:p/>
+    <w:p>
+      <w:pPr>
+        <w:pStyle w:val="Heading3"/>
+      </w:pPr>
+      <w:r>
+        <w:t xml:space="preserve">Puntos de control</w:t>
+      </w:r>
+    </w:p>
+    <w:p>
+      <w:pPr>
+        <w:pStyle w:val="ListParagraph"/>
+        <w:numPr>
+          <w:ilvl w:val="0"/>
+          <w:numId w:val="21"/>
+        </w:numPr>
+      </w:pPr>
+      <w:r>
+        <w:t xml:space="preserve">☐ Domingo 25, 23:30: las dos apps arrancan en las computadoras de Kassie y Jeshua</w:t>
+      </w:r>
+    </w:p>
+    <w:p>
+      <w:pPr>
+        <w:pStyle w:val="ListParagraph"/>
+        <w:numPr>
+          <w:ilvl w:val="0"/>
+          <w:numId w:val="21"/>
+        </w:numPr>
+      </w:pPr>
+      <w:r>
+        <w:t xml:space="preserve">☐ Lunes 26, 10:00: emparejar, guardar sin conexión y verlo en el móvil funciona en emuladores; desde aquí solo se corrigen errores</w:t>
+      </w:r>
+    </w:p>
+    <w:p>
+      <w:pPr>
+        <w:pStyle w:val="ListParagraph"/>
+        <w:numPr>
+          <w:ilvl w:val="0"/>
+          <w:numId w:val="21"/>
+        </w:numPr>
+      </w:pPr>
+      <w:r>
+        <w:t xml:space="preserve">☐ Lunes 26, 13:00: demo completa en el teléfono de Isabel con los APK</w:t>
+      </w:r>
+    </w:p>
+    <w:p>
+      <w:pPr>
+        <w:pStyle w:val="ListParagraph"/>
+        <w:numPr>
+          <w:ilvl w:val="0"/>
+          <w:numId w:val="21"/>
+        </w:numPr>
+      </w:pPr>
+      <w:r>
+        <w:t xml:space="preserve">☐ Lunes 26, 15:00: tag </w:t>
+      </w:r>
+      <w:r>
+        <w:rPr>
+          <w:rStyle w:val="CodeChar"/>
+        </w:rPr>
+        <w:t xml:space="preserve">v1.0.0</w:t>
+      </w:r>
+      <w:r>
+        <w:t xml:space="preserve"> y video de respaldo: proyecto listo</w:t>
+      </w:r>
+    </w:p>
     <w:sectPr>
       <w:pgSz w:w="12240" w:h="15840"/>
       <w:pgMar w:top="1440" w:right="1440" w:bottom="1440" w:left="1440" w:header="720" w:footer="720" w:gutter="0"/>
@@ -7531,6 +8187,9 @@
     </w:lvlOverride>
   </w:num>
   <w:num w:numId="20">
+    <w:abstractNumId w:val="0"/>
+  </w:num>
+  <w:num w:numId="21">
     <w:abstractNumId w:val="0"/>
   </w:num>
 </w:numbering>

</xml_diff>